<commit_message>
Simulation avec les bons routages
</commit_message>
<xml_diff>
--- a/Chapter 4 Methods.docx
+++ b/Chapter 4 Methods.docx
@@ -1997,53 +1997,1209 @@
         <w:t>Aberdeen site. This ensures the logistical model is stress-tested against genuine 'Best-Case' and 'Worst-Case' operational scenarios, accurately reflecting the stochastic nature of offshore environments where optimal weather windows can unexpectedly occur outside of traditional summer months.</w:t>
       </w:r>
     </w:p>
-    <w:p>
-      <w:r>
-        <w:rPr>
-          <w:noProof/>
-        </w:rPr>
-        <w:drawing>
-          <wp:inline distT="0" distB="0" distL="0" distR="0" wp14:anchorId="6EDAF227" wp14:editId="08FF9302">
-            <wp:extent cx="5731510" cy="2416810"/>
-            <wp:effectExtent l="0" t="0" r="0" b="0"/>
-            <wp:docPr id="165918245" name="Picture 4" descr="A graph showing a wave of a wave&#10;&#10;AI-generated content may be incorrect."/>
-            <wp:cNvGraphicFramePr>
-              <a:graphicFrameLocks xmlns:a="http://schemas.openxmlformats.org/drawingml/2006/main" noChangeAspect="1"/>
-            </wp:cNvGraphicFramePr>
-            <a:graphic xmlns:a="http://schemas.openxmlformats.org/drawingml/2006/main">
-              <a:graphicData uri="http://schemas.openxmlformats.org/drawingml/2006/picture">
-                <pic:pic xmlns:pic="http://schemas.openxmlformats.org/drawingml/2006/picture">
-                  <pic:nvPicPr>
-                    <pic:cNvPr id="165918245" name="Picture 4" descr="A graph showing a wave of a wave&#10;&#10;AI-generated content may be incorrect."/>
-                    <pic:cNvPicPr/>
-                  </pic:nvPicPr>
-                  <pic:blipFill>
-                    <a:blip r:embed="rId9" cstate="print">
-                      <a:extLst>
-                        <a:ext uri="{28A0092B-C50C-407E-A947-70E740481C1C}">
-                          <a14:useLocalDpi xmlns:a14="http://schemas.microsoft.com/office/drawing/2010/main" val="0"/>
-                        </a:ext>
-                      </a:extLst>
-                    </a:blip>
-                    <a:stretch>
-                      <a:fillRect/>
-                    </a:stretch>
-                  </pic:blipFill>
-                  <pic:spPr>
-                    <a:xfrm>
-                      <a:off x="0" y="0"/>
-                      <a:ext cx="5731510" cy="2416810"/>
-                    </a:xfrm>
-                    <a:prstGeom prst="rect">
-                      <a:avLst/>
-                    </a:prstGeom>
-                  </pic:spPr>
-                </pic:pic>
-              </a:graphicData>
-            </a:graphic>
-          </wp:inline>
-        </w:drawing>
-      </w:r>
+    <w:p/>
+    <w:p>
+      <w:pPr>
+        <w:spacing w:after="100" w:afterAutospacing="1" w:line="240" w:lineRule="auto"/>
+        <w:outlineLvl w:val="2"/>
+        <w:rPr>
+          <w:rFonts w:ascii="Arial" w:eastAsia="Times New Roman" w:hAnsi="Arial" w:cs="Arial"/>
+          <w:b/>
+          <w:bCs/>
+          <w:kern w:val="0"/>
+          <w:sz w:val="27"/>
+          <w:szCs w:val="27"/>
+          <w:lang w:eastAsia="en-GB"/>
+          <w14:ligatures w14:val="none"/>
+        </w:rPr>
+      </w:pPr>
+      <w:r>
+        <w:rPr>
+          <w:rFonts w:ascii="Arial" w:eastAsia="Times New Roman" w:hAnsi="Arial" w:cs="Arial"/>
+          <w:b/>
+          <w:bCs/>
+          <w:kern w:val="0"/>
+          <w:sz w:val="27"/>
+          <w:szCs w:val="27"/>
+          <w:lang w:eastAsia="en-GB"/>
+          <w14:ligatures w14:val="none"/>
+        </w:rPr>
+        <w:t>3.2.4. Representative Metocean Scenarios and Spatial Dynamics</w:t>
+      </w:r>
+    </w:p>
+    <w:p>
+      <w:pPr>
+        <w:spacing w:after="100" w:afterAutospacing="1" w:line="240" w:lineRule="auto"/>
+        <w:rPr>
+          <w:rFonts w:ascii="Arial" w:eastAsia="Times New Roman" w:hAnsi="Arial" w:cs="Arial"/>
+          <w:kern w:val="0"/>
+          <w:lang w:eastAsia="en-GB"/>
+          <w14:ligatures w14:val="none"/>
+        </w:rPr>
+      </w:pPr>
+      <w:r>
+        <w:rPr>
+          <w:rFonts w:ascii="Arial" w:eastAsia="Times New Roman" w:hAnsi="Arial" w:cs="Arial"/>
+          <w:kern w:val="0"/>
+          <w:lang w:eastAsia="en-GB"/>
+          <w14:ligatures w14:val="none"/>
+        </w:rPr>
+        <w:t xml:space="preserve">Rather than imposing arbitrary seasonal constraints to define the testing periods, this study employs an empirical, data-driven approach. By extracting the absolute minimum and maximum of the 7-day rolling average of $H_s$ over the entire year, the algorithm identified the true meteorological extremes of the Aberdeen site. To provide a comprehensive evaluation, a third "Base-Case" scenario was introduced by extracting the 7-day window closest to the annual median $H_s$. This ensures the logistical model is stress-tested against genuine 'Best-Case' and 'Worst-Case' operational scenarios, accurately reflecting the stochastic nature of offshore environments where optimal weather windows can unexpectedly occur outside of traditional summer months. </w:t>
+      </w:r>
+    </w:p>
+    <w:p>
+      <w:pPr>
+        <w:spacing w:after="100" w:afterAutospacing="1" w:line="240" w:lineRule="auto"/>
+        <w:rPr>
+          <w:rFonts w:ascii="Arial" w:eastAsia="Times New Roman" w:hAnsi="Arial" w:cs="Arial"/>
+          <w:kern w:val="0"/>
+          <w:lang w:eastAsia="en-GB"/>
+          <w14:ligatures w14:val="none"/>
+        </w:rPr>
+      </w:pPr>
+      <w:r>
+        <w:rPr>
+          <w:rFonts w:ascii="Arial" w:eastAsia="Times New Roman" w:hAnsi="Arial" w:cs="Arial"/>
+          <w:kern w:val="0"/>
+          <w:lang w:eastAsia="en-GB"/>
+          <w14:ligatures w14:val="none"/>
+        </w:rPr>
+        <w:t>To validate these scenarios and assess the resolution of the metocean data, a spatial variance analysis was executed across the five critical coordinates of the wind farm (Center, North-West, North-East, South-West, South-East).</w:t>
+      </w:r>
+    </w:p>
+    <w:p>
+      <w:pPr>
+        <w:numPr>
+          <w:ilvl w:val="0"/>
+          <w:numId w:val="5"/>
+        </w:numPr>
+        <w:spacing w:after="100" w:afterAutospacing="1" w:line="240" w:lineRule="auto"/>
+        <w:rPr>
+          <w:rFonts w:ascii="Arial" w:eastAsia="Times New Roman" w:hAnsi="Arial" w:cs="Arial"/>
+          <w:kern w:val="0"/>
+          <w:lang w:eastAsia="en-GB"/>
+          <w14:ligatures w14:val="none"/>
+        </w:rPr>
+      </w:pPr>
+      <w:r>
+        <w:rPr>
+          <w:rFonts w:ascii="Arial" w:eastAsia="Times New Roman" w:hAnsi="Arial" w:cs="Arial"/>
+          <w:b/>
+          <w:bCs/>
+          <w:kern w:val="0"/>
+          <w:lang w:eastAsia="en-GB"/>
+          <w14:ligatures w14:val="none"/>
+        </w:rPr>
+        <w:t>Best-Case Scenario (High-Availability):</w:t>
+      </w:r>
+      <w:r>
+        <w:rPr>
+          <w:rFonts w:ascii="Arial" w:eastAsia="Times New Roman" w:hAnsi="Arial" w:cs="Arial"/>
+          <w:kern w:val="0"/>
+          <w:lang w:eastAsia="en-GB"/>
+          <w14:ligatures w14:val="none"/>
+        </w:rPr>
+        <w:t xml:space="preserve"> The Significant Wave Height ($H_s$) remains universally below the 1.3m CTV operational limit for the entire campaign. Spatial variance is negligible, allowing operations to proceed unhindered.</w:t>
+      </w:r>
+    </w:p>
+    <w:p>
+      <w:pPr>
+        <w:numPr>
+          <w:ilvl w:val="0"/>
+          <w:numId w:val="5"/>
+        </w:numPr>
+        <w:spacing w:after="100" w:afterAutospacing="1" w:line="240" w:lineRule="auto"/>
+        <w:rPr>
+          <w:rFonts w:ascii="Arial" w:eastAsia="Times New Roman" w:hAnsi="Arial" w:cs="Arial"/>
+          <w:kern w:val="0"/>
+          <w:lang w:eastAsia="en-GB"/>
+          <w14:ligatures w14:val="none"/>
+        </w:rPr>
+      </w:pPr>
+      <w:r>
+        <w:rPr>
+          <w:rFonts w:ascii="Arial" w:eastAsia="Times New Roman" w:hAnsi="Arial" w:cs="Arial"/>
+          <w:b/>
+          <w:bCs/>
+          <w:kern w:val="0"/>
+          <w:lang w:eastAsia="en-GB"/>
+          <w14:ligatures w14:val="none"/>
+        </w:rPr>
+        <w:t>Base-Case Scenario (Typical Operations):</w:t>
+      </w:r>
+      <w:r>
+        <w:rPr>
+          <w:rFonts w:ascii="Arial" w:eastAsia="Times New Roman" w:hAnsi="Arial" w:cs="Arial"/>
+          <w:kern w:val="0"/>
+          <w:lang w:eastAsia="en-GB"/>
+          <w14:ligatures w14:val="none"/>
+        </w:rPr>
+        <w:t xml:space="preserve"> This scenario represents the critical logistical trade-off. $H_s$ fluctuates closely around the 1.3m threshold while remaining safely below the 3.5m SOV limit. Spatial divergence becomes noticeable during minor wave peaks, creating intermittent access windows that heavily penalize CTVs while favoring SOVs.</w:t>
+      </w:r>
+    </w:p>
+    <w:p>
+      <w:pPr>
+        <w:numPr>
+          <w:ilvl w:val="0"/>
+          <w:numId w:val="5"/>
+        </w:numPr>
+        <w:spacing w:after="100" w:afterAutospacing="1" w:line="240" w:lineRule="auto"/>
+        <w:rPr>
+          <w:rFonts w:ascii="Arial" w:eastAsia="Times New Roman" w:hAnsi="Arial" w:cs="Arial"/>
+          <w:kern w:val="0"/>
+          <w:lang w:eastAsia="en-GB"/>
+          <w14:ligatures w14:val="none"/>
+        </w:rPr>
+      </w:pPr>
+      <w:r>
+        <w:rPr>
+          <w:rFonts w:ascii="Arial" w:eastAsia="Times New Roman" w:hAnsi="Arial" w:cs="Arial"/>
+          <w:b/>
+          <w:bCs/>
+          <w:kern w:val="0"/>
+          <w:lang w:eastAsia="en-GB"/>
+          <w14:ligatures w14:val="none"/>
+        </w:rPr>
+        <w:t>Worst-Case Scenario (High-Downtime):</w:t>
+      </w:r>
+      <w:r>
+        <w:rPr>
+          <w:rFonts w:ascii="Arial" w:eastAsia="Times New Roman" w:hAnsi="Arial" w:cs="Arial"/>
+          <w:kern w:val="0"/>
+          <w:lang w:eastAsia="en-GB"/>
+          <w14:ligatures w14:val="none"/>
+        </w:rPr>
+        <w:t xml:space="preserve"> During severe low-pressure passages, $H_s$ significantly exceeds all vessel limits. As illustrated by the spatial extraction, a distinct East-West gradient was observed during low-pressure passages. The wave height difference between the South-East and North-West boundaries reached nearly 1 meter, confirming the theoretical existence of localized micro-windows on the farm's edges. </w:t>
+      </w:r>
+    </w:p>
+    <w:p>
+      <w:pPr>
+        <w:spacing w:after="100" w:afterAutospacing="1" w:line="240" w:lineRule="auto"/>
+        <w:rPr>
+          <w:rFonts w:ascii="Arial" w:eastAsia="Times New Roman" w:hAnsi="Arial" w:cs="Arial"/>
+          <w:kern w:val="0"/>
+          <w:lang w:eastAsia="en-GB"/>
+          <w14:ligatures w14:val="none"/>
+        </w:rPr>
+      </w:pPr>
+      <w:r>
+        <w:rPr>
+          <w:rFonts w:ascii="Arial" w:eastAsia="Times New Roman" w:hAnsi="Arial" w:cs="Arial"/>
+          <w:kern w:val="0"/>
+          <w:lang w:eastAsia="en-GB"/>
+          <w14:ligatures w14:val="none"/>
+        </w:rPr>
+        <w:t xml:space="preserve">While a highly complex routing algorithm could theoretically exploit these micro-windows, this study maintains the assumption of a single reference point at the farm's center to prevent an explosion of algorithmic complexity, which would shift the project into a dynamic spatio-temporal routing problem beyond the intended scope. Consequently, all daily weather gates in the simulation are evaluated against the barycenter's environmental state. </w:t>
+      </w:r>
+    </w:p>
+    <w:p/>
+    <w:p/>
+    <w:p>
+      <w:pPr>
+        <w:spacing w:before="100" w:beforeAutospacing="1" w:after="100" w:afterAutospacing="1" w:line="240" w:lineRule="auto"/>
+        <w:outlineLvl w:val="2"/>
+        <w:rPr>
+          <w:rFonts w:ascii="Times New Roman" w:eastAsia="Times New Roman" w:hAnsi="Times New Roman" w:cs="Times New Roman"/>
+          <w:b/>
+          <w:bCs/>
+          <w:kern w:val="0"/>
+          <w:sz w:val="27"/>
+          <w:szCs w:val="27"/>
+          <w:lang w:eastAsia="en-GB"/>
+          <w14:ligatures w14:val="none"/>
+        </w:rPr>
+      </w:pPr>
+      <w:r>
+        <w:rPr>
+          <w:rFonts w:ascii="Times New Roman" w:eastAsia="Times New Roman" w:hAnsi="Times New Roman" w:cs="Times New Roman"/>
+          <w:b/>
+          <w:bCs/>
+          <w:kern w:val="0"/>
+          <w:sz w:val="27"/>
+          <w:szCs w:val="27"/>
+          <w:lang w:eastAsia="en-GB"/>
+          <w14:ligatures w14:val="none"/>
+        </w:rPr>
+        <w:lastRenderedPageBreak/>
+        <w:t>Le Plan de Bataille (L'Exécution de la Matrice)</w:t>
+      </w:r>
+    </w:p>
+    <w:p>
+      <w:pPr>
+        <w:spacing w:before="100" w:beforeAutospacing="1" w:after="100" w:afterAutospacing="1" w:line="240" w:lineRule="auto"/>
+        <w:rPr>
+          <w:rFonts w:ascii="Times New Roman" w:eastAsia="Times New Roman" w:hAnsi="Times New Roman" w:cs="Times New Roman"/>
+          <w:kern w:val="0"/>
+          <w:lang w:eastAsia="en-GB"/>
+          <w14:ligatures w14:val="none"/>
+        </w:rPr>
+      </w:pPr>
+      <w:r>
+        <w:rPr>
+          <w:rFonts w:ascii="Times New Roman" w:eastAsia="Times New Roman" w:hAnsi="Times New Roman" w:cs="Times New Roman"/>
+          <w:kern w:val="0"/>
+          <w:lang w:eastAsia="en-GB"/>
+          <w14:ligatures w14:val="none"/>
+        </w:rPr>
+        <w:t>Pour avoir des résultats complets à présenter à ton jury, tu vas devoir faire tourner ton modèle pour couvrir toutes les combinaisons de ta matrice de recherche. Tu as 12 simulations à générer au total :</w:t>
+      </w:r>
+    </w:p>
+    <w:p>
+      <w:pPr>
+        <w:spacing w:before="100" w:beforeAutospacing="1" w:after="100" w:afterAutospacing="1" w:line="240" w:lineRule="auto"/>
+        <w:rPr>
+          <w:rFonts w:ascii="Times New Roman" w:eastAsia="Times New Roman" w:hAnsi="Times New Roman" w:cs="Times New Roman"/>
+          <w:kern w:val="0"/>
+          <w:lang w:eastAsia="en-GB"/>
+          <w14:ligatures w14:val="none"/>
+        </w:rPr>
+      </w:pPr>
+      <w:r>
+        <w:rPr>
+          <w:rFonts w:ascii="Times New Roman" w:eastAsia="Times New Roman" w:hAnsi="Times New Roman" w:cs="Times New Roman"/>
+          <w:b/>
+          <w:bCs/>
+          <w:kern w:val="0"/>
+          <w:lang w:eastAsia="en-GB"/>
+          <w14:ligatures w14:val="none"/>
+        </w:rPr>
+        <w:t>1. Scénario "Best-Case" (La semaine d'été calme)</w:t>
+      </w:r>
+    </w:p>
+    <w:p>
+      <w:pPr>
+        <w:numPr>
+          <w:ilvl w:val="0"/>
+          <w:numId w:val="6"/>
+        </w:numPr>
+        <w:spacing w:before="100" w:beforeAutospacing="1" w:after="100" w:afterAutospacing="1" w:line="240" w:lineRule="auto"/>
+        <w:rPr>
+          <w:rFonts w:ascii="Times New Roman" w:eastAsia="Times New Roman" w:hAnsi="Times New Roman" w:cs="Times New Roman"/>
+          <w:kern w:val="0"/>
+          <w:lang w:eastAsia="en-GB"/>
+          <w14:ligatures w14:val="none"/>
+        </w:rPr>
+      </w:pPr>
+      <w:r>
+        <w:rPr>
+          <w:rFonts w:ascii="Times New Roman" w:eastAsia="Times New Roman" w:hAnsi="Times New Roman" w:cs="Times New Roman"/>
+          <w:kern w:val="0"/>
+          <w:lang w:eastAsia="en-GB"/>
+          <w14:ligatures w14:val="none"/>
+        </w:rPr>
+        <w:t>Préventif + CTV</w:t>
+      </w:r>
+    </w:p>
+    <w:p>
+      <w:pPr>
+        <w:numPr>
+          <w:ilvl w:val="0"/>
+          <w:numId w:val="6"/>
+        </w:numPr>
+        <w:spacing w:before="100" w:beforeAutospacing="1" w:after="100" w:afterAutospacing="1" w:line="240" w:lineRule="auto"/>
+        <w:rPr>
+          <w:rFonts w:ascii="Times New Roman" w:eastAsia="Times New Roman" w:hAnsi="Times New Roman" w:cs="Times New Roman"/>
+          <w:kern w:val="0"/>
+          <w:lang w:eastAsia="en-GB"/>
+          <w14:ligatures w14:val="none"/>
+        </w:rPr>
+      </w:pPr>
+      <w:r>
+        <w:rPr>
+          <w:rFonts w:ascii="Times New Roman" w:eastAsia="Times New Roman" w:hAnsi="Times New Roman" w:cs="Times New Roman"/>
+          <w:kern w:val="0"/>
+          <w:lang w:eastAsia="en-GB"/>
+          <w14:ligatures w14:val="none"/>
+        </w:rPr>
+        <w:t>Préventif + SOV</w:t>
+      </w:r>
+    </w:p>
+    <w:p>
+      <w:pPr>
+        <w:numPr>
+          <w:ilvl w:val="0"/>
+          <w:numId w:val="6"/>
+        </w:numPr>
+        <w:spacing w:before="100" w:beforeAutospacing="1" w:after="100" w:afterAutospacing="1" w:line="240" w:lineRule="auto"/>
+        <w:rPr>
+          <w:rFonts w:ascii="Times New Roman" w:eastAsia="Times New Roman" w:hAnsi="Times New Roman" w:cs="Times New Roman"/>
+          <w:kern w:val="0"/>
+          <w:lang w:eastAsia="en-GB"/>
+          <w14:ligatures w14:val="none"/>
+        </w:rPr>
+      </w:pPr>
+      <w:r>
+        <w:rPr>
+          <w:rFonts w:ascii="Times New Roman" w:eastAsia="Times New Roman" w:hAnsi="Times New Roman" w:cs="Times New Roman"/>
+          <w:kern w:val="0"/>
+          <w:lang w:eastAsia="en-GB"/>
+          <w14:ligatures w14:val="none"/>
+        </w:rPr>
+        <w:t>Prédictif + CTV</w:t>
+      </w:r>
+    </w:p>
+    <w:p>
+      <w:pPr>
+        <w:numPr>
+          <w:ilvl w:val="0"/>
+          <w:numId w:val="6"/>
+        </w:numPr>
+        <w:spacing w:before="100" w:beforeAutospacing="1" w:after="100" w:afterAutospacing="1" w:line="240" w:lineRule="auto"/>
+        <w:rPr>
+          <w:rFonts w:ascii="Times New Roman" w:eastAsia="Times New Roman" w:hAnsi="Times New Roman" w:cs="Times New Roman"/>
+          <w:kern w:val="0"/>
+          <w:lang w:eastAsia="en-GB"/>
+          <w14:ligatures w14:val="none"/>
+        </w:rPr>
+      </w:pPr>
+      <w:r>
+        <w:rPr>
+          <w:rFonts w:ascii="Times New Roman" w:eastAsia="Times New Roman" w:hAnsi="Times New Roman" w:cs="Times New Roman"/>
+          <w:kern w:val="0"/>
+          <w:lang w:eastAsia="en-GB"/>
+          <w14:ligatures w14:val="none"/>
+        </w:rPr>
+        <w:t>Prédictif + SOV</w:t>
+      </w:r>
+    </w:p>
+    <w:p>
+      <w:pPr>
+        <w:spacing w:before="100" w:beforeAutospacing="1" w:after="100" w:afterAutospacing="1" w:line="240" w:lineRule="auto"/>
+        <w:rPr>
+          <w:rFonts w:ascii="Times New Roman" w:eastAsia="Times New Roman" w:hAnsi="Times New Roman" w:cs="Times New Roman"/>
+          <w:kern w:val="0"/>
+          <w:lang w:eastAsia="en-GB"/>
+          <w14:ligatures w14:val="none"/>
+        </w:rPr>
+      </w:pPr>
+      <w:r>
+        <w:rPr>
+          <w:rFonts w:ascii="Times New Roman" w:eastAsia="Times New Roman" w:hAnsi="Times New Roman" w:cs="Times New Roman"/>
+          <w:b/>
+          <w:bCs/>
+          <w:kern w:val="0"/>
+          <w:lang w:eastAsia="en-GB"/>
+          <w14:ligatures w14:val="none"/>
+        </w:rPr>
+        <w:t>2. Scénario "Base-Case" (La semaine typique/médiane)</w:t>
+      </w:r>
+    </w:p>
+    <w:p>
+      <w:pPr>
+        <w:numPr>
+          <w:ilvl w:val="0"/>
+          <w:numId w:val="7"/>
+        </w:numPr>
+        <w:spacing w:before="100" w:beforeAutospacing="1" w:after="100" w:afterAutospacing="1" w:line="240" w:lineRule="auto"/>
+        <w:rPr>
+          <w:rFonts w:ascii="Times New Roman" w:eastAsia="Times New Roman" w:hAnsi="Times New Roman" w:cs="Times New Roman"/>
+          <w:kern w:val="0"/>
+          <w:lang w:eastAsia="en-GB"/>
+          <w14:ligatures w14:val="none"/>
+        </w:rPr>
+      </w:pPr>
+      <w:r>
+        <w:rPr>
+          <w:rFonts w:ascii="Times New Roman" w:eastAsia="Times New Roman" w:hAnsi="Times New Roman" w:cs="Times New Roman"/>
+          <w:kern w:val="0"/>
+          <w:lang w:eastAsia="en-GB"/>
+          <w14:ligatures w14:val="none"/>
+        </w:rPr>
+        <w:t>Préventif + CTV</w:t>
+      </w:r>
+    </w:p>
+    <w:p>
+      <w:pPr>
+        <w:numPr>
+          <w:ilvl w:val="0"/>
+          <w:numId w:val="7"/>
+        </w:numPr>
+        <w:spacing w:before="100" w:beforeAutospacing="1" w:after="100" w:afterAutospacing="1" w:line="240" w:lineRule="auto"/>
+        <w:rPr>
+          <w:rFonts w:ascii="Times New Roman" w:eastAsia="Times New Roman" w:hAnsi="Times New Roman" w:cs="Times New Roman"/>
+          <w:kern w:val="0"/>
+          <w:lang w:eastAsia="en-GB"/>
+          <w14:ligatures w14:val="none"/>
+        </w:rPr>
+      </w:pPr>
+      <w:r>
+        <w:rPr>
+          <w:rFonts w:ascii="Times New Roman" w:eastAsia="Times New Roman" w:hAnsi="Times New Roman" w:cs="Times New Roman"/>
+          <w:kern w:val="0"/>
+          <w:lang w:eastAsia="en-GB"/>
+          <w14:ligatures w14:val="none"/>
+        </w:rPr>
+        <w:t>Préventif + SOV</w:t>
+      </w:r>
+    </w:p>
+    <w:p>
+      <w:pPr>
+        <w:numPr>
+          <w:ilvl w:val="0"/>
+          <w:numId w:val="7"/>
+        </w:numPr>
+        <w:spacing w:before="100" w:beforeAutospacing="1" w:after="100" w:afterAutospacing="1" w:line="240" w:lineRule="auto"/>
+        <w:rPr>
+          <w:rFonts w:ascii="Times New Roman" w:eastAsia="Times New Roman" w:hAnsi="Times New Roman" w:cs="Times New Roman"/>
+          <w:kern w:val="0"/>
+          <w:lang w:eastAsia="en-GB"/>
+          <w14:ligatures w14:val="none"/>
+        </w:rPr>
+      </w:pPr>
+      <w:r>
+        <w:rPr>
+          <w:rFonts w:ascii="Times New Roman" w:eastAsia="Times New Roman" w:hAnsi="Times New Roman" w:cs="Times New Roman"/>
+          <w:kern w:val="0"/>
+          <w:lang w:eastAsia="en-GB"/>
+          <w14:ligatures w14:val="none"/>
+        </w:rPr>
+        <w:t>Prédictif + CTV</w:t>
+      </w:r>
+    </w:p>
+    <w:p>
+      <w:pPr>
+        <w:numPr>
+          <w:ilvl w:val="0"/>
+          <w:numId w:val="7"/>
+        </w:numPr>
+        <w:spacing w:before="100" w:beforeAutospacing="1" w:after="100" w:afterAutospacing="1" w:line="240" w:lineRule="auto"/>
+        <w:rPr>
+          <w:rFonts w:ascii="Times New Roman" w:eastAsia="Times New Roman" w:hAnsi="Times New Roman" w:cs="Times New Roman"/>
+          <w:kern w:val="0"/>
+          <w:lang w:eastAsia="en-GB"/>
+          <w14:ligatures w14:val="none"/>
+        </w:rPr>
+      </w:pPr>
+      <w:r>
+        <w:rPr>
+          <w:rFonts w:ascii="Times New Roman" w:eastAsia="Times New Roman" w:hAnsi="Times New Roman" w:cs="Times New Roman"/>
+          <w:kern w:val="0"/>
+          <w:lang w:eastAsia="en-GB"/>
+          <w14:ligatures w14:val="none"/>
+        </w:rPr>
+        <w:t>Prédictif + SOV</w:t>
+      </w:r>
+    </w:p>
+    <w:p>
+      <w:pPr>
+        <w:spacing w:before="100" w:beforeAutospacing="1" w:after="100" w:afterAutospacing="1" w:line="240" w:lineRule="auto"/>
+        <w:rPr>
+          <w:rFonts w:ascii="Times New Roman" w:eastAsia="Times New Roman" w:hAnsi="Times New Roman" w:cs="Times New Roman"/>
+          <w:kern w:val="0"/>
+          <w:lang w:eastAsia="en-GB"/>
+          <w14:ligatures w14:val="none"/>
+        </w:rPr>
+      </w:pPr>
+      <w:r>
+        <w:rPr>
+          <w:rFonts w:ascii="Times New Roman" w:eastAsia="Times New Roman" w:hAnsi="Times New Roman" w:cs="Times New Roman"/>
+          <w:b/>
+          <w:bCs/>
+          <w:kern w:val="0"/>
+          <w:lang w:eastAsia="en-GB"/>
+          <w14:ligatures w14:val="none"/>
+        </w:rPr>
+        <w:t>3. Scénario "Worst-Case" (La tempête d'hiver)</w:t>
+      </w:r>
+    </w:p>
+    <w:p>
+      <w:pPr>
+        <w:numPr>
+          <w:ilvl w:val="0"/>
+          <w:numId w:val="8"/>
+        </w:numPr>
+        <w:spacing w:before="100" w:beforeAutospacing="1" w:after="100" w:afterAutospacing="1" w:line="240" w:lineRule="auto"/>
+        <w:rPr>
+          <w:rFonts w:ascii="Times New Roman" w:eastAsia="Times New Roman" w:hAnsi="Times New Roman" w:cs="Times New Roman"/>
+          <w:kern w:val="0"/>
+          <w:lang w:eastAsia="en-GB"/>
+          <w14:ligatures w14:val="none"/>
+        </w:rPr>
+      </w:pPr>
+      <w:r>
+        <w:rPr>
+          <w:rFonts w:ascii="Times New Roman" w:eastAsia="Times New Roman" w:hAnsi="Times New Roman" w:cs="Times New Roman"/>
+          <w:kern w:val="0"/>
+          <w:lang w:eastAsia="en-GB"/>
+          <w14:ligatures w14:val="none"/>
+        </w:rPr>
+        <w:t>Préventif + CTV</w:t>
+      </w:r>
+    </w:p>
+    <w:p>
+      <w:pPr>
+        <w:numPr>
+          <w:ilvl w:val="0"/>
+          <w:numId w:val="8"/>
+        </w:numPr>
+        <w:spacing w:before="100" w:beforeAutospacing="1" w:after="100" w:afterAutospacing="1" w:line="240" w:lineRule="auto"/>
+        <w:rPr>
+          <w:rFonts w:ascii="Times New Roman" w:eastAsia="Times New Roman" w:hAnsi="Times New Roman" w:cs="Times New Roman"/>
+          <w:kern w:val="0"/>
+          <w:lang w:eastAsia="en-GB"/>
+          <w14:ligatures w14:val="none"/>
+        </w:rPr>
+      </w:pPr>
+      <w:r>
+        <w:rPr>
+          <w:rFonts w:ascii="Times New Roman" w:eastAsia="Times New Roman" w:hAnsi="Times New Roman" w:cs="Times New Roman"/>
+          <w:kern w:val="0"/>
+          <w:lang w:eastAsia="en-GB"/>
+          <w14:ligatures w14:val="none"/>
+        </w:rPr>
+        <w:t>Préventif + SOV</w:t>
+      </w:r>
+    </w:p>
+    <w:p>
+      <w:pPr>
+        <w:numPr>
+          <w:ilvl w:val="0"/>
+          <w:numId w:val="8"/>
+        </w:numPr>
+        <w:spacing w:before="100" w:beforeAutospacing="1" w:after="100" w:afterAutospacing="1" w:line="240" w:lineRule="auto"/>
+        <w:rPr>
+          <w:rFonts w:ascii="Times New Roman" w:eastAsia="Times New Roman" w:hAnsi="Times New Roman" w:cs="Times New Roman"/>
+          <w:kern w:val="0"/>
+          <w:lang w:eastAsia="en-GB"/>
+          <w14:ligatures w14:val="none"/>
+        </w:rPr>
+      </w:pPr>
+      <w:r>
+        <w:rPr>
+          <w:rFonts w:ascii="Times New Roman" w:eastAsia="Times New Roman" w:hAnsi="Times New Roman" w:cs="Times New Roman"/>
+          <w:kern w:val="0"/>
+          <w:lang w:eastAsia="en-GB"/>
+          <w14:ligatures w14:val="none"/>
+        </w:rPr>
+        <w:t>Prédictif + CTV</w:t>
+      </w:r>
+    </w:p>
+    <w:p>
+      <w:pPr>
+        <w:numPr>
+          <w:ilvl w:val="0"/>
+          <w:numId w:val="8"/>
+        </w:numPr>
+        <w:spacing w:before="100" w:beforeAutospacing="1" w:after="100" w:afterAutospacing="1" w:line="240" w:lineRule="auto"/>
+        <w:rPr>
+          <w:rFonts w:ascii="Times New Roman" w:eastAsia="Times New Roman" w:hAnsi="Times New Roman" w:cs="Times New Roman"/>
+          <w:kern w:val="0"/>
+          <w:lang w:eastAsia="en-GB"/>
+          <w14:ligatures w14:val="none"/>
+        </w:rPr>
+      </w:pPr>
+      <w:r>
+        <w:rPr>
+          <w:rFonts w:ascii="Times New Roman" w:eastAsia="Times New Roman" w:hAnsi="Times New Roman" w:cs="Times New Roman"/>
+          <w:kern w:val="0"/>
+          <w:lang w:eastAsia="en-GB"/>
+          <w14:ligatures w14:val="none"/>
+        </w:rPr>
+        <w:t>Prédictif + SOV</w:t>
+      </w:r>
+    </w:p>
+    <w:p/>
+    <w:p>
+      <w:pPr>
+        <w:pStyle w:val="ListParagraph"/>
+        <w:numPr>
+          <w:ilvl w:val="0"/>
+          <w:numId w:val="9"/>
+        </w:numPr>
+      </w:pPr>
+      <w:r>
+        <w:t>Contrairement au papers de frederiksen j’utilise seulement un vessel et je n’utilise pas la logique de bus stop qui dépose des techniciens et qui va à la prochaine WT pour déposer une autre équipe pui qui retourne chercher l’équipe d’avant une fois qu’ils ont fini car c’est trop complexe pour le temps imparti de la dissertation et aussi parce que ce nest pas le coeur meme de mon sujet de dissertation je ne minteresse pas vraiment a la logique de routing et d’optimisation de la logistique mais plutot de limpact meteo sur le choix de la strategie de maintenance</w:t>
+      </w:r>
+    </w:p>
+    <w:p>
+      <w:pPr>
+        <w:pStyle w:val="ListParagraph"/>
+        <w:numPr>
+          <w:ilvl w:val="0"/>
+          <w:numId w:val="9"/>
+        </w:numPr>
+      </w:pPr>
+      <w:r>
+        <w:t>Tester 3 profils d’IA pour voir la sensibilité à la précision de l’IA de ma rentabilité financière (perfect, standard, mediocre)</w:t>
+      </w:r>
+    </w:p>
+    <w:p>
+      <w:pPr>
+        <w:pStyle w:val="ListParagraph"/>
+        <w:numPr>
+          <w:ilvl w:val="0"/>
+          <w:numId w:val="9"/>
+        </w:numPr>
+      </w:pPr>
+      <w:r>
+        <w:t>Intécgré le vent si jai le temps if wind speed&gt;40 knots then safe=false (ou alors je garde cette option pour la section futur work de mon mémoire)</w:t>
+      </w:r>
+      <w:r>
+        <w:t xml:space="preserve"> </w:t>
+      </w:r>
+      <w:r>
+        <w:rPr>
+          <w:rStyle w:val="citation-24"/>
+          <w:rFonts w:ascii="Arial" w:hAnsi="Arial" w:cs="Arial"/>
+        </w:rPr>
+        <w:t>While safe Service Operation Vessel (SOV) deployments are constrained by both Significant Wave Height (</w:t>
+      </w:r>
+      <w:r>
+        <w:rPr>
+          <w:rStyle w:val="math-inline"/>
+          <w:rFonts w:ascii="Arial" w:hAnsi="Arial" w:cs="Arial"/>
+        </w:rPr>
+        <w:t>$H_s$</w:t>
+      </w:r>
+      <w:r>
+        <w:rPr>
+          <w:rStyle w:val="citation-24"/>
+          <w:rFonts w:ascii="Arial" w:hAnsi="Arial" w:cs="Arial"/>
+        </w:rPr>
+        <w:t xml:space="preserve"> limit of 3.5m) and wind speed (typically capped at 40 knots for safe gangway transfers), this simulation utilizes </w:t>
+      </w:r>
+      <w:r>
+        <w:rPr>
+          <w:rStyle w:val="math-inline"/>
+          <w:rFonts w:ascii="Arial" w:hAnsi="Arial" w:cs="Arial"/>
+        </w:rPr>
+        <w:t>$H_s$</w:t>
+      </w:r>
+      <w:r>
+        <w:rPr>
+          <w:rStyle w:val="citation-24"/>
+          <w:rFonts w:ascii="Arial" w:hAnsi="Arial" w:cs="Arial"/>
+        </w:rPr>
+        <w:t xml:space="preserve"> as a standalone proxy for metocean severity. A review of the Copernicus Global Ocean Wave dataset </w:t>
+      </w:r>
+      <w:r>
+        <w:rPr>
+          <w:rStyle w:val="citation-24"/>
+          <w:rFonts w:ascii="Arial" w:hAnsi="Arial" w:cs="Arial"/>
+        </w:rPr>
+        <w:lastRenderedPageBreak/>
+        <w:t xml:space="preserve">(GLOBAL_ANALYSISFORECAST_WAV_001_027) </w:t>
+      </w:r>
+      <w:r>
+        <w:rPr>
+          <w:rFonts w:ascii="Arial" w:hAnsi="Arial" w:cs="Arial"/>
+        </w:rPr>
+        <w:t>confirmed that raw atmospheric wind variables are not exported within the wave model outputs. Because extreme wind events in the Aberdeen offshore region are overwhelmingly correlated with high sea states exceeding the 3.5m threshold, introducing a secondary meteorological constraint would exponentially increase the data-fetching architecture without substantially altering the vessel's 'No-Go' daily matrix. The integration of a multi-variable weather gate (Wind + Waves) relying on overlapping satellite datasets represents a highly relevant avenue for future model expansions.</w:t>
+      </w:r>
+    </w:p>
+    <w:p>
+      <w:pPr>
+        <w:pStyle w:val="ListParagraph"/>
+        <w:numPr>
+          <w:ilvl w:val="0"/>
+          <w:numId w:val="9"/>
+        </w:numPr>
+      </w:pPr>
+      <w:r>
+        <w:t xml:space="preserve">Fuel SOV logique de standby consommation continue </w:t>
+      </w:r>
+    </w:p>
+    <w:p>
+      <w:pPr>
+        <w:pStyle w:val="ListParagraph"/>
+        <w:numPr>
+          <w:ilvl w:val="0"/>
+          <w:numId w:val="9"/>
+        </w:numPr>
+      </w:pPr>
+      <w:r>
+        <w:t xml:space="preserve">Wind factor constant : </w:t>
+      </w:r>
+      <w:r>
+        <w:t>Bien que les conditions éoliennes soient corrélées aux conditions de houle, cette étude isole la performance logistique en maintenant un facteur de vent (W_factor) constant de 0.9. Cette simplification permet d'évaluer l'impact pur des 'weather gates' maritimes sur la capacité de maintenance, sans introduire de biais économique lié à la variabilité de la production d'énergie, laquelle est traitée comme une constante de revenue potentielle.</w:t>
+      </w:r>
+    </w:p>
+    <w:p>
+      <w:pPr>
+        <w:pStyle w:val="NormalWeb"/>
+        <w:spacing w:before="0" w:beforeAutospacing="0"/>
+        <w:rPr>
+          <w:rFonts w:ascii="Arial" w:hAnsi="Arial" w:cs="Arial"/>
+        </w:rPr>
+      </w:pPr>
+      <w:r>
+        <w:rPr>
+          <w:rFonts w:ascii="Arial" w:hAnsi="Arial" w:cs="Arial"/>
+        </w:rPr>
+        <w:t>Voici ta vraie matrice complète, optimisée et sans doublons :</w:t>
+      </w:r>
+    </w:p>
+    <w:p>
+      <w:pPr>
+        <w:pStyle w:val="NormalWeb"/>
+        <w:numPr>
+          <w:ilvl w:val="0"/>
+          <w:numId w:val="10"/>
+        </w:numPr>
+        <w:spacing w:before="0" w:beforeAutospacing="0"/>
+        <w:rPr>
+          <w:rFonts w:ascii="Arial" w:hAnsi="Arial" w:cs="Arial"/>
+        </w:rPr>
+      </w:pPr>
+      <w:r>
+        <w:rPr>
+          <w:rFonts w:ascii="Arial" w:hAnsi="Arial" w:cs="Arial"/>
+          <w:b/>
+          <w:bCs/>
+        </w:rPr>
+        <w:t>Préventif (Indépendant de l'IA) :</w:t>
+      </w:r>
+      <w:r>
+        <w:rPr>
+          <w:rFonts w:ascii="Arial" w:hAnsi="Arial" w:cs="Arial"/>
+        </w:rPr>
+        <w:t xml:space="preserve"> 3 Météos </w:t>
+      </w:r>
+      <w:r>
+        <w:rPr>
+          <w:rStyle w:val="math-inline"/>
+          <w:rFonts w:ascii="Arial" w:eastAsiaTheme="majorEastAsia" w:hAnsi="Arial" w:cs="Arial"/>
+        </w:rPr>
+        <w:t>$\times$</w:t>
+      </w:r>
+      <w:r>
+        <w:rPr>
+          <w:rFonts w:ascii="Arial" w:hAnsi="Arial" w:cs="Arial"/>
+        </w:rPr>
+        <w:t xml:space="preserve"> 2 Navires = </w:t>
+      </w:r>
+      <w:r>
+        <w:rPr>
+          <w:rFonts w:ascii="Arial" w:hAnsi="Arial" w:cs="Arial"/>
+          <w:b/>
+          <w:bCs/>
+        </w:rPr>
+        <w:t>6 simulations</w:t>
+      </w:r>
+      <w:r>
+        <w:rPr>
+          <w:rFonts w:ascii="Arial" w:hAnsi="Arial" w:cs="Arial"/>
+        </w:rPr>
+        <w:t>.</w:t>
+      </w:r>
+    </w:p>
+    <w:p>
+      <w:pPr>
+        <w:pStyle w:val="NormalWeb"/>
+        <w:numPr>
+          <w:ilvl w:val="0"/>
+          <w:numId w:val="10"/>
+        </w:numPr>
+        <w:spacing w:before="0" w:beforeAutospacing="0"/>
+        <w:rPr>
+          <w:rFonts w:ascii="Arial" w:hAnsi="Arial" w:cs="Arial"/>
+        </w:rPr>
+      </w:pPr>
+      <w:r>
+        <w:rPr>
+          <w:rFonts w:ascii="Arial" w:hAnsi="Arial" w:cs="Arial"/>
+          <w:b/>
+          <w:bCs/>
+        </w:rPr>
+        <w:t>Prédictif (Dépendant de l'IA) :</w:t>
+      </w:r>
+      <w:r>
+        <w:rPr>
+          <w:rFonts w:ascii="Arial" w:hAnsi="Arial" w:cs="Arial"/>
+        </w:rPr>
+        <w:t xml:space="preserve"> 3 Météos </w:t>
+      </w:r>
+      <w:r>
+        <w:rPr>
+          <w:rStyle w:val="math-inline"/>
+          <w:rFonts w:ascii="Arial" w:eastAsiaTheme="majorEastAsia" w:hAnsi="Arial" w:cs="Arial"/>
+        </w:rPr>
+        <w:t>$\times$</w:t>
+      </w:r>
+      <w:r>
+        <w:rPr>
+          <w:rFonts w:ascii="Arial" w:hAnsi="Arial" w:cs="Arial"/>
+        </w:rPr>
+        <w:t xml:space="preserve"> 2 Navires </w:t>
+      </w:r>
+      <w:r>
+        <w:rPr>
+          <w:rStyle w:val="math-inline"/>
+          <w:rFonts w:ascii="Arial" w:eastAsiaTheme="majorEastAsia" w:hAnsi="Arial" w:cs="Arial"/>
+        </w:rPr>
+        <w:t>$\times$</w:t>
+      </w:r>
+      <w:r>
+        <w:rPr>
+          <w:rFonts w:ascii="Arial" w:hAnsi="Arial" w:cs="Arial"/>
+        </w:rPr>
+        <w:t xml:space="preserve"> 3 IA = </w:t>
+      </w:r>
+      <w:r>
+        <w:rPr>
+          <w:rFonts w:ascii="Arial" w:hAnsi="Arial" w:cs="Arial"/>
+          <w:b/>
+          <w:bCs/>
+        </w:rPr>
+        <w:t>18 simulations</w:t>
+      </w:r>
+      <w:r>
+        <w:rPr>
+          <w:rFonts w:ascii="Arial" w:hAnsi="Arial" w:cs="Arial"/>
+        </w:rPr>
+        <w:t>.</w:t>
+      </w:r>
+    </w:p>
+    <w:p>
+      <w:pPr>
+        <w:pStyle w:val="NormalWeb"/>
+        <w:numPr>
+          <w:ilvl w:val="0"/>
+          <w:numId w:val="10"/>
+        </w:numPr>
+        <w:spacing w:before="0" w:beforeAutospacing="0"/>
+        <w:rPr>
+          <w:rFonts w:ascii="Arial" w:hAnsi="Arial" w:cs="Arial"/>
+        </w:rPr>
+      </w:pPr>
+      <w:r>
+        <w:rPr>
+          <w:rFonts w:ascii="Arial" w:hAnsi="Arial" w:cs="Arial"/>
+          <w:b/>
+          <w:bCs/>
+        </w:rPr>
+        <w:t>Total = 24 simulations complètes.</w:t>
+      </w:r>
+      <w:r>
+        <w:rPr>
+          <w:rFonts w:ascii="Arial" w:hAnsi="Arial" w:cs="Arial"/>
+        </w:rPr>
+        <w:t xml:space="preserve"> Avec cela, tu couvres 100 % de ton sujet d'étude sans faire tourner ton ordinateur dans le vide.</w:t>
+      </w:r>
+    </w:p>
+    <w:p>
+      <w:pPr>
+        <w:pStyle w:val="NormalWeb"/>
+      </w:pPr>
+      <w:r>
+        <w:t xml:space="preserve">Quand tu lanceras </w:t>
+      </w:r>
+      <w:r>
+        <w:rPr>
+          <w:rStyle w:val="HTMLCode"/>
+          <w:rFonts w:eastAsiaTheme="majorEastAsia"/>
+        </w:rPr>
+        <w:t>run_all.py</w:t>
+      </w:r>
+      <w:r>
+        <w:t xml:space="preserve">, ton dossier principal restera parfaitement propre. Il va se créer un dossier </w:t>
+      </w:r>
+      <w:r>
+        <w:rPr>
+          <w:rStyle w:val="HTMLCode"/>
+          <w:rFonts w:eastAsiaTheme="majorEastAsia"/>
+        </w:rPr>
+        <w:t>Simulation_Results</w:t>
+      </w:r>
+      <w:r>
+        <w:t xml:space="preserve"> qui ressemblera à ça :</w:t>
+      </w:r>
+    </w:p>
+    <w:p>
+      <w:pPr>
+        <w:pStyle w:val="NormalWeb"/>
+        <w:numPr>
+          <w:ilvl w:val="0"/>
+          <w:numId w:val="11"/>
+        </w:numPr>
+      </w:pPr>
+      <w:r>
+        <w:rPr>
+          <w:rFonts w:ascii="Apple Color Emoji" w:hAnsi="Apple Color Emoji" w:cs="Apple Color Emoji"/>
+        </w:rPr>
+        <w:t>📁</w:t>
+      </w:r>
+      <w:r>
+        <w:t xml:space="preserve"> </w:t>
+      </w:r>
+      <w:r>
+        <w:rPr>
+          <w:rStyle w:val="HTMLCode"/>
+          <w:rFonts w:eastAsiaTheme="majorEastAsia"/>
+        </w:rPr>
+        <w:t>Simulation_Results</w:t>
+      </w:r>
+    </w:p>
+    <w:p>
+      <w:pPr>
+        <w:pStyle w:val="NormalWeb"/>
+        <w:numPr>
+          <w:ilvl w:val="1"/>
+          <w:numId w:val="11"/>
+        </w:numPr>
+      </w:pPr>
+      <w:r>
+        <w:rPr>
+          <w:rFonts w:ascii="Apple Color Emoji" w:hAnsi="Apple Color Emoji" w:cs="Apple Color Emoji"/>
+        </w:rPr>
+        <w:t>📁</w:t>
+      </w:r>
+      <w:r>
+        <w:t xml:space="preserve"> </w:t>
+      </w:r>
+      <w:r>
+        <w:rPr>
+          <w:rStyle w:val="HTMLCode"/>
+          <w:rFonts w:eastAsiaTheme="majorEastAsia"/>
+        </w:rPr>
+        <w:t>Best-Case_Perfect_AI</w:t>
+      </w:r>
+    </w:p>
+    <w:p>
+      <w:pPr>
+        <w:pStyle w:val="NormalWeb"/>
+        <w:numPr>
+          <w:ilvl w:val="2"/>
+          <w:numId w:val="11"/>
+        </w:numPr>
+      </w:pPr>
+      <w:r>
+        <w:rPr>
+          <w:rFonts w:ascii="Apple Color Emoji" w:hAnsi="Apple Color Emoji" w:cs="Apple Color Emoji"/>
+        </w:rPr>
+        <w:t>📁</w:t>
+      </w:r>
+      <w:r>
+        <w:t xml:space="preserve"> </w:t>
+      </w:r>
+      <w:r>
+        <w:rPr>
+          <w:rStyle w:val="HTMLCode"/>
+          <w:rFonts w:eastAsiaTheme="majorEastAsia"/>
+        </w:rPr>
+        <w:t>Routes</w:t>
+      </w:r>
+      <w:r>
+        <w:t xml:space="preserve"> (Contiendra </w:t>
+      </w:r>
+      <w:r>
+        <w:rPr>
+          <w:i/>
+          <w:iCs/>
+        </w:rPr>
+        <w:t>Route_Day_1.png</w:t>
+      </w:r>
+      <w:r>
+        <w:t xml:space="preserve">, </w:t>
+      </w:r>
+      <w:r>
+        <w:rPr>
+          <w:i/>
+          <w:iCs/>
+        </w:rPr>
+        <w:t>Route_Day_2.png</w:t>
+      </w:r>
+      <w:r>
+        <w:t>, etc.)</w:t>
+      </w:r>
+    </w:p>
+    <w:p>
+      <w:pPr>
+        <w:pStyle w:val="NormalWeb"/>
+        <w:numPr>
+          <w:ilvl w:val="2"/>
+          <w:numId w:val="11"/>
+        </w:numPr>
+      </w:pPr>
+      <w:r>
+        <w:rPr>
+          <w:rFonts w:ascii="Apple Color Emoji" w:hAnsi="Apple Color Emoji" w:cs="Apple Color Emoji"/>
+        </w:rPr>
+        <w:t>📁</w:t>
+      </w:r>
+      <w:r>
+        <w:t xml:space="preserve"> </w:t>
+      </w:r>
+      <w:r>
+        <w:rPr>
+          <w:rStyle w:val="HTMLCode"/>
+          <w:rFonts w:eastAsiaTheme="majorEastAsia"/>
+        </w:rPr>
+        <w:t>Tables</w:t>
+      </w:r>
+      <w:r>
+        <w:t xml:space="preserve"> (Contiendra </w:t>
+      </w:r>
+      <w:r>
+        <w:rPr>
+          <w:i/>
+          <w:iCs/>
+        </w:rPr>
+        <w:t>Financial_Summary.png</w:t>
+      </w:r>
+      <w:r>
+        <w:t xml:space="preserve">, </w:t>
+      </w:r>
+      <w:r>
+        <w:rPr>
+          <w:i/>
+          <w:iCs/>
+        </w:rPr>
+        <w:t>Downtime_Summary.png</w:t>
+      </w:r>
+      <w:r>
+        <w:t>)</w:t>
+      </w:r>
+    </w:p>
+    <w:p>
+      <w:pPr>
+        <w:pStyle w:val="NormalWeb"/>
+        <w:numPr>
+          <w:ilvl w:val="2"/>
+          <w:numId w:val="11"/>
+        </w:numPr>
+      </w:pPr>
+      <w:r>
+        <w:rPr>
+          <w:rFonts w:ascii="Apple Color Emoji" w:hAnsi="Apple Color Emoji" w:cs="Apple Color Emoji"/>
+        </w:rPr>
+        <w:t>📄</w:t>
+      </w:r>
+      <w:r>
+        <w:t xml:space="preserve"> </w:t>
+      </w:r>
+      <w:r>
+        <w:rPr>
+          <w:rStyle w:val="HTMLCode"/>
+          <w:rFonts w:eastAsiaTheme="majorEastAsia"/>
+        </w:rPr>
+        <w:t>Config_Log.txt</w:t>
+      </w:r>
+    </w:p>
+    <w:p>
+      <w:pPr>
+        <w:pStyle w:val="NormalWeb"/>
+        <w:numPr>
+          <w:ilvl w:val="1"/>
+          <w:numId w:val="11"/>
+        </w:numPr>
+      </w:pPr>
+      <w:r>
+        <w:rPr>
+          <w:rFonts w:ascii="Apple Color Emoji" w:hAnsi="Apple Color Emoji" w:cs="Apple Color Emoji"/>
+        </w:rPr>
+        <w:t>📁</w:t>
+      </w:r>
+      <w:r>
+        <w:t xml:space="preserve"> </w:t>
+      </w:r>
+      <w:r>
+        <w:rPr>
+          <w:rStyle w:val="HTMLCode"/>
+          <w:rFonts w:eastAsiaTheme="majorEastAsia"/>
+        </w:rPr>
+        <w:t>Worst-Case_No_AI</w:t>
+      </w:r>
+    </w:p>
+    <w:p>
+      <w:pPr>
+        <w:pStyle w:val="NormalWeb"/>
+        <w:numPr>
+          <w:ilvl w:val="2"/>
+          <w:numId w:val="11"/>
+        </w:numPr>
+      </w:pPr>
+      <w:r>
+        <w:rPr>
+          <w:rFonts w:ascii="Apple Color Emoji" w:hAnsi="Apple Color Emoji" w:cs="Apple Color Emoji"/>
+        </w:rPr>
+        <w:t>📁</w:t>
+      </w:r>
+      <w:r>
+        <w:t xml:space="preserve"> </w:t>
+      </w:r>
+      <w:r>
+        <w:rPr>
+          <w:rStyle w:val="HTMLCode"/>
+          <w:rFonts w:eastAsiaTheme="majorEastAsia"/>
+        </w:rPr>
+        <w:t>Routes</w:t>
+      </w:r>
+    </w:p>
+    <w:p>
+      <w:pPr>
+        <w:pStyle w:val="NormalWeb"/>
+        <w:numPr>
+          <w:ilvl w:val="2"/>
+          <w:numId w:val="11"/>
+        </w:numPr>
+      </w:pPr>
+      <w:r>
+        <w:rPr>
+          <w:rFonts w:ascii="Apple Color Emoji" w:hAnsi="Apple Color Emoji" w:cs="Apple Color Emoji"/>
+        </w:rPr>
+        <w:t>📁</w:t>
+      </w:r>
+      <w:r>
+        <w:t xml:space="preserve"> </w:t>
+      </w:r>
+      <w:r>
+        <w:rPr>
+          <w:rStyle w:val="HTMLCode"/>
+          <w:rFonts w:eastAsiaTheme="majorEastAsia"/>
+        </w:rPr>
+        <w:t>Tables</w:t>
+      </w:r>
+    </w:p>
+    <w:p>
+      <w:pPr>
+        <w:pStyle w:val="NormalWeb"/>
+        <w:numPr>
+          <w:ilvl w:val="2"/>
+          <w:numId w:val="11"/>
+        </w:numPr>
+      </w:pPr>
+      <w:r>
+        <w:rPr>
+          <w:rFonts w:ascii="Apple Color Emoji" w:hAnsi="Apple Color Emoji" w:cs="Apple Color Emoji"/>
+        </w:rPr>
+        <w:t>📄</w:t>
+      </w:r>
+      <w:r>
+        <w:t xml:space="preserve"> </w:t>
+      </w:r>
+      <w:r>
+        <w:rPr>
+          <w:rStyle w:val="HTMLCode"/>
+          <w:rFonts w:eastAsiaTheme="majorEastAsia"/>
+        </w:rPr>
+        <w:t>Config_Log.txt</w:t>
+      </w:r>
+    </w:p>
+    <w:p>
+      <w:pPr>
+        <w:pStyle w:val="NormalWeb"/>
+        <w:numPr>
+          <w:ilvl w:val="1"/>
+          <w:numId w:val="11"/>
+        </w:numPr>
+      </w:pPr>
+      <w:r>
+        <w:rPr>
+          <w:i/>
+          <w:iCs/>
+        </w:rPr>
+        <w:t>(etc. pour tes 24 simulations)</w:t>
+      </w:r>
+    </w:p>
+    <w:p>
+      <w:pPr>
+        <w:pStyle w:val="ListParagraph"/>
+        <w:numPr>
+          <w:ilvl w:val="0"/>
+          <w:numId w:val="9"/>
+        </w:numPr>
+      </w:pPr>
     </w:p>
     <w:sectPr>
       <w:pgSz w:w="11906" w:h="16838"/>
@@ -2058,6 +3214,155 @@
 <file path=word/numbering.xml><?xml version="1.0" encoding="utf-8"?>
 <w:numbering xmlns:wpc="http://schemas.microsoft.com/office/word/2010/wordprocessingCanvas" xmlns:cx="http://schemas.microsoft.com/office/drawing/2014/chartex" xmlns:cx1="http://schemas.microsoft.com/office/drawing/2015/9/8/chartex" xmlns:cx2="http://schemas.microsoft.com/office/drawing/2015/10/21/chartex" xmlns:cx3="http://schemas.microsoft.com/office/drawing/2016/5/9/chartex" xmlns:cx4="http://schemas.microsoft.com/office/drawing/2016/5/10/chartex" xmlns:cx5="http://schemas.microsoft.com/office/drawing/2016/5/11/chartex" xmlns:cx6="http://schemas.microsoft.com/office/drawing/2016/5/12/chartex" xmlns:cx7="http://schemas.microsoft.com/office/drawing/2016/5/13/chartex" xmlns:cx8="http://schemas.microsoft.com/office/drawing/2016/5/14/chartex" xmlns:mc="http://schemas.openxmlformats.org/markup-compatibility/2006" xmlns:aink="http://schemas.microsoft.com/office/drawing/2016/ink" xmlns:am3d="http://schemas.microsoft.com/office/drawing/2017/model3d" xmlns:o="urn:schemas-microsoft-com:office:office" xmlns:oel="http://schemas.microsoft.com/office/2019/extlst" xmlns:r="http://schemas.openxmlformats.org/officeDocument/2006/relationships" xmlns:m="http://schemas.openxmlformats.org/officeDocument/2006/math" xmlns:v="urn:schemas-microsoft-com:vml" xmlns:wp14="http://schemas.microsoft.com/office/word/2010/wordprocessingDrawing" xmlns:wp="http://schemas.openxmlformats.org/drawingml/2006/wordprocessingDrawing" xmlns:w10="urn:schemas-microsoft-com:office:word" xmlns:w="http://schemas.openxmlformats.org/wordprocessingml/2006/main" xmlns:w14="http://schemas.microsoft.com/office/word/2010/wordml" xmlns:w15="http://schemas.microsoft.com/office/word/2012/wordml" xmlns:w16cex="http://schemas.microsoft.com/office/word/2018/wordml/cex" xmlns:w16cid="http://schemas.microsoft.com/office/word/2016/wordml/cid" xmlns:w16="http://schemas.microsoft.com/office/word/2018/wordml" xmlns:w16du="http://schemas.microsoft.com/office/word/2023/wordml/word16du" xmlns:w16sdtdh="http://schemas.microsoft.com/office/word/2020/wordml/sdtdatahash" xmlns:w16sdtfl="http://schemas.microsoft.com/office/word/2024/wordml/sdtformatlock" xmlns:w16se="http://schemas.microsoft.com/office/word/2015/wordml/symex" xmlns:wpg="http://schemas.microsoft.com/office/word/2010/wordprocessingGroup" xmlns:wpi="http://schemas.microsoft.com/office/word/2010/wordprocessingInk" xmlns:wne="http://schemas.microsoft.com/office/word/2006/wordml" xmlns:wps="http://schemas.microsoft.com/office/word/2010/wordprocessingShape" mc:Ignorable="w14 w15 w16se w16cid w16 w16cex w16sdtdh w16sdtfl w16du wp14">
   <w:abstractNum w:abstractNumId="0" w15:restartNumberingAfterBreak="0">
+    <w:nsid w:val="0B9F0975"/>
+    <w:multiLevelType w:val="multilevel"/>
+    <w:tmpl w:val="042C6FC0"/>
+    <w:lvl w:ilvl="0">
+      <w:start w:val="1"/>
+      <w:numFmt w:val="bullet"/>
+      <w:lvlText w:val=""/>
+      <w:lvlJc w:val="left"/>
+      <w:pPr>
+        <w:tabs>
+          <w:tab w:val="num" w:pos="720"/>
+        </w:tabs>
+        <w:ind w:left="720" w:hanging="360"/>
+      </w:pPr>
+      <w:rPr>
+        <w:rFonts w:ascii="Symbol" w:hAnsi="Symbol" w:hint="default"/>
+        <w:sz w:val="20"/>
+      </w:rPr>
+    </w:lvl>
+    <w:lvl w:ilvl="1" w:tentative="1">
+      <w:start w:val="1"/>
+      <w:numFmt w:val="bullet"/>
+      <w:lvlText w:val="o"/>
+      <w:lvlJc w:val="left"/>
+      <w:pPr>
+        <w:tabs>
+          <w:tab w:val="num" w:pos="1440"/>
+        </w:tabs>
+        <w:ind w:left="1440" w:hanging="360"/>
+      </w:pPr>
+      <w:rPr>
+        <w:rFonts w:ascii="Courier New" w:hAnsi="Courier New" w:hint="default"/>
+        <w:sz w:val="20"/>
+      </w:rPr>
+    </w:lvl>
+    <w:lvl w:ilvl="2" w:tentative="1">
+      <w:start w:val="1"/>
+      <w:numFmt w:val="bullet"/>
+      <w:lvlText w:val=""/>
+      <w:lvlJc w:val="left"/>
+      <w:pPr>
+        <w:tabs>
+          <w:tab w:val="num" w:pos="2160"/>
+        </w:tabs>
+        <w:ind w:left="2160" w:hanging="360"/>
+      </w:pPr>
+      <w:rPr>
+        <w:rFonts w:ascii="Wingdings" w:hAnsi="Wingdings" w:hint="default"/>
+        <w:sz w:val="20"/>
+      </w:rPr>
+    </w:lvl>
+    <w:lvl w:ilvl="3" w:tentative="1">
+      <w:start w:val="1"/>
+      <w:numFmt w:val="bullet"/>
+      <w:lvlText w:val=""/>
+      <w:lvlJc w:val="left"/>
+      <w:pPr>
+        <w:tabs>
+          <w:tab w:val="num" w:pos="2880"/>
+        </w:tabs>
+        <w:ind w:left="2880" w:hanging="360"/>
+      </w:pPr>
+      <w:rPr>
+        <w:rFonts w:ascii="Wingdings" w:hAnsi="Wingdings" w:hint="default"/>
+        <w:sz w:val="20"/>
+      </w:rPr>
+    </w:lvl>
+    <w:lvl w:ilvl="4" w:tentative="1">
+      <w:start w:val="1"/>
+      <w:numFmt w:val="bullet"/>
+      <w:lvlText w:val=""/>
+      <w:lvlJc w:val="left"/>
+      <w:pPr>
+        <w:tabs>
+          <w:tab w:val="num" w:pos="3600"/>
+        </w:tabs>
+        <w:ind w:left="3600" w:hanging="360"/>
+      </w:pPr>
+      <w:rPr>
+        <w:rFonts w:ascii="Wingdings" w:hAnsi="Wingdings" w:hint="default"/>
+        <w:sz w:val="20"/>
+      </w:rPr>
+    </w:lvl>
+    <w:lvl w:ilvl="5" w:tentative="1">
+      <w:start w:val="1"/>
+      <w:numFmt w:val="bullet"/>
+      <w:lvlText w:val=""/>
+      <w:lvlJc w:val="left"/>
+      <w:pPr>
+        <w:tabs>
+          <w:tab w:val="num" w:pos="4320"/>
+        </w:tabs>
+        <w:ind w:left="4320" w:hanging="360"/>
+      </w:pPr>
+      <w:rPr>
+        <w:rFonts w:ascii="Wingdings" w:hAnsi="Wingdings" w:hint="default"/>
+        <w:sz w:val="20"/>
+      </w:rPr>
+    </w:lvl>
+    <w:lvl w:ilvl="6" w:tentative="1">
+      <w:start w:val="1"/>
+      <w:numFmt w:val="bullet"/>
+      <w:lvlText w:val=""/>
+      <w:lvlJc w:val="left"/>
+      <w:pPr>
+        <w:tabs>
+          <w:tab w:val="num" w:pos="5040"/>
+        </w:tabs>
+        <w:ind w:left="5040" w:hanging="360"/>
+      </w:pPr>
+      <w:rPr>
+        <w:rFonts w:ascii="Wingdings" w:hAnsi="Wingdings" w:hint="default"/>
+        <w:sz w:val="20"/>
+      </w:rPr>
+    </w:lvl>
+    <w:lvl w:ilvl="7" w:tentative="1">
+      <w:start w:val="1"/>
+      <w:numFmt w:val="bullet"/>
+      <w:lvlText w:val=""/>
+      <w:lvlJc w:val="left"/>
+      <w:pPr>
+        <w:tabs>
+          <w:tab w:val="num" w:pos="5760"/>
+        </w:tabs>
+        <w:ind w:left="5760" w:hanging="360"/>
+      </w:pPr>
+      <w:rPr>
+        <w:rFonts w:ascii="Wingdings" w:hAnsi="Wingdings" w:hint="default"/>
+        <w:sz w:val="20"/>
+      </w:rPr>
+    </w:lvl>
+    <w:lvl w:ilvl="8" w:tentative="1">
+      <w:start w:val="1"/>
+      <w:numFmt w:val="bullet"/>
+      <w:lvlText w:val=""/>
+      <w:lvlJc w:val="left"/>
+      <w:pPr>
+        <w:tabs>
+          <w:tab w:val="num" w:pos="6480"/>
+        </w:tabs>
+        <w:ind w:left="6480" w:hanging="360"/>
+      </w:pPr>
+      <w:rPr>
+        <w:rFonts w:ascii="Wingdings" w:hAnsi="Wingdings" w:hint="default"/>
+        <w:sz w:val="20"/>
+      </w:rPr>
+    </w:lvl>
+  </w:abstractNum>
+  <w:abstractNum w:abstractNumId="1" w15:restartNumberingAfterBreak="0">
     <w:nsid w:val="1540684C"/>
     <w:multiLevelType w:val="multilevel"/>
     <w:tmpl w:val="D4F2CCC6"/>
@@ -2206,7 +3511,305 @@
       </w:rPr>
     </w:lvl>
   </w:abstractNum>
-  <w:abstractNum w:abstractNumId="1" w15:restartNumberingAfterBreak="0">
+  <w:abstractNum w:abstractNumId="2" w15:restartNumberingAfterBreak="0">
+    <w:nsid w:val="1F245421"/>
+    <w:multiLevelType w:val="multilevel"/>
+    <w:tmpl w:val="91C4BAA4"/>
+    <w:lvl w:ilvl="0">
+      <w:start w:val="1"/>
+      <w:numFmt w:val="bullet"/>
+      <w:lvlText w:val=""/>
+      <w:lvlJc w:val="left"/>
+      <w:pPr>
+        <w:tabs>
+          <w:tab w:val="num" w:pos="720"/>
+        </w:tabs>
+        <w:ind w:left="720" w:hanging="360"/>
+      </w:pPr>
+      <w:rPr>
+        <w:rFonts w:ascii="Symbol" w:hAnsi="Symbol" w:hint="default"/>
+        <w:sz w:val="20"/>
+      </w:rPr>
+    </w:lvl>
+    <w:lvl w:ilvl="1" w:tentative="1">
+      <w:start w:val="1"/>
+      <w:numFmt w:val="bullet"/>
+      <w:lvlText w:val="o"/>
+      <w:lvlJc w:val="left"/>
+      <w:pPr>
+        <w:tabs>
+          <w:tab w:val="num" w:pos="1440"/>
+        </w:tabs>
+        <w:ind w:left="1440" w:hanging="360"/>
+      </w:pPr>
+      <w:rPr>
+        <w:rFonts w:ascii="Courier New" w:hAnsi="Courier New" w:hint="default"/>
+        <w:sz w:val="20"/>
+      </w:rPr>
+    </w:lvl>
+    <w:lvl w:ilvl="2" w:tentative="1">
+      <w:start w:val="1"/>
+      <w:numFmt w:val="bullet"/>
+      <w:lvlText w:val=""/>
+      <w:lvlJc w:val="left"/>
+      <w:pPr>
+        <w:tabs>
+          <w:tab w:val="num" w:pos="2160"/>
+        </w:tabs>
+        <w:ind w:left="2160" w:hanging="360"/>
+      </w:pPr>
+      <w:rPr>
+        <w:rFonts w:ascii="Wingdings" w:hAnsi="Wingdings" w:hint="default"/>
+        <w:sz w:val="20"/>
+      </w:rPr>
+    </w:lvl>
+    <w:lvl w:ilvl="3" w:tentative="1">
+      <w:start w:val="1"/>
+      <w:numFmt w:val="bullet"/>
+      <w:lvlText w:val=""/>
+      <w:lvlJc w:val="left"/>
+      <w:pPr>
+        <w:tabs>
+          <w:tab w:val="num" w:pos="2880"/>
+        </w:tabs>
+        <w:ind w:left="2880" w:hanging="360"/>
+      </w:pPr>
+      <w:rPr>
+        <w:rFonts w:ascii="Wingdings" w:hAnsi="Wingdings" w:hint="default"/>
+        <w:sz w:val="20"/>
+      </w:rPr>
+    </w:lvl>
+    <w:lvl w:ilvl="4" w:tentative="1">
+      <w:start w:val="1"/>
+      <w:numFmt w:val="bullet"/>
+      <w:lvlText w:val=""/>
+      <w:lvlJc w:val="left"/>
+      <w:pPr>
+        <w:tabs>
+          <w:tab w:val="num" w:pos="3600"/>
+        </w:tabs>
+        <w:ind w:left="3600" w:hanging="360"/>
+      </w:pPr>
+      <w:rPr>
+        <w:rFonts w:ascii="Wingdings" w:hAnsi="Wingdings" w:hint="default"/>
+        <w:sz w:val="20"/>
+      </w:rPr>
+    </w:lvl>
+    <w:lvl w:ilvl="5" w:tentative="1">
+      <w:start w:val="1"/>
+      <w:numFmt w:val="bullet"/>
+      <w:lvlText w:val=""/>
+      <w:lvlJc w:val="left"/>
+      <w:pPr>
+        <w:tabs>
+          <w:tab w:val="num" w:pos="4320"/>
+        </w:tabs>
+        <w:ind w:left="4320" w:hanging="360"/>
+      </w:pPr>
+      <w:rPr>
+        <w:rFonts w:ascii="Wingdings" w:hAnsi="Wingdings" w:hint="default"/>
+        <w:sz w:val="20"/>
+      </w:rPr>
+    </w:lvl>
+    <w:lvl w:ilvl="6" w:tentative="1">
+      <w:start w:val="1"/>
+      <w:numFmt w:val="bullet"/>
+      <w:lvlText w:val=""/>
+      <w:lvlJc w:val="left"/>
+      <w:pPr>
+        <w:tabs>
+          <w:tab w:val="num" w:pos="5040"/>
+        </w:tabs>
+        <w:ind w:left="5040" w:hanging="360"/>
+      </w:pPr>
+      <w:rPr>
+        <w:rFonts w:ascii="Wingdings" w:hAnsi="Wingdings" w:hint="default"/>
+        <w:sz w:val="20"/>
+      </w:rPr>
+    </w:lvl>
+    <w:lvl w:ilvl="7" w:tentative="1">
+      <w:start w:val="1"/>
+      <w:numFmt w:val="bullet"/>
+      <w:lvlText w:val=""/>
+      <w:lvlJc w:val="left"/>
+      <w:pPr>
+        <w:tabs>
+          <w:tab w:val="num" w:pos="5760"/>
+        </w:tabs>
+        <w:ind w:left="5760" w:hanging="360"/>
+      </w:pPr>
+      <w:rPr>
+        <w:rFonts w:ascii="Wingdings" w:hAnsi="Wingdings" w:hint="default"/>
+        <w:sz w:val="20"/>
+      </w:rPr>
+    </w:lvl>
+    <w:lvl w:ilvl="8" w:tentative="1">
+      <w:start w:val="1"/>
+      <w:numFmt w:val="bullet"/>
+      <w:lvlText w:val=""/>
+      <w:lvlJc w:val="left"/>
+      <w:pPr>
+        <w:tabs>
+          <w:tab w:val="num" w:pos="6480"/>
+        </w:tabs>
+        <w:ind w:left="6480" w:hanging="360"/>
+      </w:pPr>
+      <w:rPr>
+        <w:rFonts w:ascii="Wingdings" w:hAnsi="Wingdings" w:hint="default"/>
+        <w:sz w:val="20"/>
+      </w:rPr>
+    </w:lvl>
+  </w:abstractNum>
+  <w:abstractNum w:abstractNumId="3" w15:restartNumberingAfterBreak="0">
+    <w:nsid w:val="241A21D5"/>
+    <w:multiLevelType w:val="multilevel"/>
+    <w:tmpl w:val="4A228AB4"/>
+    <w:lvl w:ilvl="0">
+      <w:start w:val="1"/>
+      <w:numFmt w:val="bullet"/>
+      <w:lvlText w:val=""/>
+      <w:lvlJc w:val="left"/>
+      <w:pPr>
+        <w:tabs>
+          <w:tab w:val="num" w:pos="720"/>
+        </w:tabs>
+        <w:ind w:left="720" w:hanging="360"/>
+      </w:pPr>
+      <w:rPr>
+        <w:rFonts w:ascii="Symbol" w:hAnsi="Symbol" w:hint="default"/>
+        <w:sz w:val="20"/>
+      </w:rPr>
+    </w:lvl>
+    <w:lvl w:ilvl="1" w:tentative="1">
+      <w:start w:val="1"/>
+      <w:numFmt w:val="bullet"/>
+      <w:lvlText w:val="o"/>
+      <w:lvlJc w:val="left"/>
+      <w:pPr>
+        <w:tabs>
+          <w:tab w:val="num" w:pos="1440"/>
+        </w:tabs>
+        <w:ind w:left="1440" w:hanging="360"/>
+      </w:pPr>
+      <w:rPr>
+        <w:rFonts w:ascii="Courier New" w:hAnsi="Courier New" w:hint="default"/>
+        <w:sz w:val="20"/>
+      </w:rPr>
+    </w:lvl>
+    <w:lvl w:ilvl="2" w:tentative="1">
+      <w:start w:val="1"/>
+      <w:numFmt w:val="bullet"/>
+      <w:lvlText w:val=""/>
+      <w:lvlJc w:val="left"/>
+      <w:pPr>
+        <w:tabs>
+          <w:tab w:val="num" w:pos="2160"/>
+        </w:tabs>
+        <w:ind w:left="2160" w:hanging="360"/>
+      </w:pPr>
+      <w:rPr>
+        <w:rFonts w:ascii="Wingdings" w:hAnsi="Wingdings" w:hint="default"/>
+        <w:sz w:val="20"/>
+      </w:rPr>
+    </w:lvl>
+    <w:lvl w:ilvl="3" w:tentative="1">
+      <w:start w:val="1"/>
+      <w:numFmt w:val="bullet"/>
+      <w:lvlText w:val=""/>
+      <w:lvlJc w:val="left"/>
+      <w:pPr>
+        <w:tabs>
+          <w:tab w:val="num" w:pos="2880"/>
+        </w:tabs>
+        <w:ind w:left="2880" w:hanging="360"/>
+      </w:pPr>
+      <w:rPr>
+        <w:rFonts w:ascii="Wingdings" w:hAnsi="Wingdings" w:hint="default"/>
+        <w:sz w:val="20"/>
+      </w:rPr>
+    </w:lvl>
+    <w:lvl w:ilvl="4" w:tentative="1">
+      <w:start w:val="1"/>
+      <w:numFmt w:val="bullet"/>
+      <w:lvlText w:val=""/>
+      <w:lvlJc w:val="left"/>
+      <w:pPr>
+        <w:tabs>
+          <w:tab w:val="num" w:pos="3600"/>
+        </w:tabs>
+        <w:ind w:left="3600" w:hanging="360"/>
+      </w:pPr>
+      <w:rPr>
+        <w:rFonts w:ascii="Wingdings" w:hAnsi="Wingdings" w:hint="default"/>
+        <w:sz w:val="20"/>
+      </w:rPr>
+    </w:lvl>
+    <w:lvl w:ilvl="5" w:tentative="1">
+      <w:start w:val="1"/>
+      <w:numFmt w:val="bullet"/>
+      <w:lvlText w:val=""/>
+      <w:lvlJc w:val="left"/>
+      <w:pPr>
+        <w:tabs>
+          <w:tab w:val="num" w:pos="4320"/>
+        </w:tabs>
+        <w:ind w:left="4320" w:hanging="360"/>
+      </w:pPr>
+      <w:rPr>
+        <w:rFonts w:ascii="Wingdings" w:hAnsi="Wingdings" w:hint="default"/>
+        <w:sz w:val="20"/>
+      </w:rPr>
+    </w:lvl>
+    <w:lvl w:ilvl="6" w:tentative="1">
+      <w:start w:val="1"/>
+      <w:numFmt w:val="bullet"/>
+      <w:lvlText w:val=""/>
+      <w:lvlJc w:val="left"/>
+      <w:pPr>
+        <w:tabs>
+          <w:tab w:val="num" w:pos="5040"/>
+        </w:tabs>
+        <w:ind w:left="5040" w:hanging="360"/>
+      </w:pPr>
+      <w:rPr>
+        <w:rFonts w:ascii="Wingdings" w:hAnsi="Wingdings" w:hint="default"/>
+        <w:sz w:val="20"/>
+      </w:rPr>
+    </w:lvl>
+    <w:lvl w:ilvl="7" w:tentative="1">
+      <w:start w:val="1"/>
+      <w:numFmt w:val="bullet"/>
+      <w:lvlText w:val=""/>
+      <w:lvlJc w:val="left"/>
+      <w:pPr>
+        <w:tabs>
+          <w:tab w:val="num" w:pos="5760"/>
+        </w:tabs>
+        <w:ind w:left="5760" w:hanging="360"/>
+      </w:pPr>
+      <w:rPr>
+        <w:rFonts w:ascii="Wingdings" w:hAnsi="Wingdings" w:hint="default"/>
+        <w:sz w:val="20"/>
+      </w:rPr>
+    </w:lvl>
+    <w:lvl w:ilvl="8" w:tentative="1">
+      <w:start w:val="1"/>
+      <w:numFmt w:val="bullet"/>
+      <w:lvlText w:val=""/>
+      <w:lvlJc w:val="left"/>
+      <w:pPr>
+        <w:tabs>
+          <w:tab w:val="num" w:pos="6480"/>
+        </w:tabs>
+        <w:ind w:left="6480" w:hanging="360"/>
+      </w:pPr>
+      <w:rPr>
+        <w:rFonts w:ascii="Wingdings" w:hAnsi="Wingdings" w:hint="default"/>
+        <w:sz w:val="20"/>
+      </w:rPr>
+    </w:lvl>
+  </w:abstractNum>
+  <w:abstractNum w:abstractNumId="4" w15:restartNumberingAfterBreak="0">
     <w:nsid w:val="31EB3B18"/>
     <w:multiLevelType w:val="multilevel"/>
     <w:tmpl w:val="A95E1DE6"/>
@@ -2319,7 +3922,418 @@
       </w:pPr>
     </w:lvl>
   </w:abstractNum>
-  <w:abstractNum w:abstractNumId="2" w15:restartNumberingAfterBreak="0">
+  <w:abstractNum w:abstractNumId="5" w15:restartNumberingAfterBreak="0">
+    <w:nsid w:val="366C0187"/>
+    <w:multiLevelType w:val="multilevel"/>
+    <w:tmpl w:val="6AA81582"/>
+    <w:lvl w:ilvl="0">
+      <w:start w:val="1"/>
+      <w:numFmt w:val="bullet"/>
+      <w:lvlText w:val=""/>
+      <w:lvlJc w:val="left"/>
+      <w:pPr>
+        <w:tabs>
+          <w:tab w:val="num" w:pos="720"/>
+        </w:tabs>
+        <w:ind w:left="720" w:hanging="360"/>
+      </w:pPr>
+      <w:rPr>
+        <w:rFonts w:ascii="Symbol" w:hAnsi="Symbol" w:hint="default"/>
+        <w:sz w:val="20"/>
+      </w:rPr>
+    </w:lvl>
+    <w:lvl w:ilvl="1">
+      <w:start w:val="1"/>
+      <w:numFmt w:val="bullet"/>
+      <w:lvlText w:val="o"/>
+      <w:lvlJc w:val="left"/>
+      <w:pPr>
+        <w:tabs>
+          <w:tab w:val="num" w:pos="1440"/>
+        </w:tabs>
+        <w:ind w:left="1440" w:hanging="360"/>
+      </w:pPr>
+      <w:rPr>
+        <w:rFonts w:ascii="Courier New" w:hAnsi="Courier New" w:hint="default"/>
+        <w:sz w:val="20"/>
+      </w:rPr>
+    </w:lvl>
+    <w:lvl w:ilvl="2">
+      <w:start w:val="1"/>
+      <w:numFmt w:val="bullet"/>
+      <w:lvlText w:val=""/>
+      <w:lvlJc w:val="left"/>
+      <w:pPr>
+        <w:tabs>
+          <w:tab w:val="num" w:pos="2160"/>
+        </w:tabs>
+        <w:ind w:left="2160" w:hanging="360"/>
+      </w:pPr>
+      <w:rPr>
+        <w:rFonts w:ascii="Wingdings" w:hAnsi="Wingdings" w:hint="default"/>
+        <w:sz w:val="20"/>
+      </w:rPr>
+    </w:lvl>
+    <w:lvl w:ilvl="3" w:tentative="1">
+      <w:start w:val="1"/>
+      <w:numFmt w:val="bullet"/>
+      <w:lvlText w:val=""/>
+      <w:lvlJc w:val="left"/>
+      <w:pPr>
+        <w:tabs>
+          <w:tab w:val="num" w:pos="2880"/>
+        </w:tabs>
+        <w:ind w:left="2880" w:hanging="360"/>
+      </w:pPr>
+      <w:rPr>
+        <w:rFonts w:ascii="Wingdings" w:hAnsi="Wingdings" w:hint="default"/>
+        <w:sz w:val="20"/>
+      </w:rPr>
+    </w:lvl>
+    <w:lvl w:ilvl="4" w:tentative="1">
+      <w:start w:val="1"/>
+      <w:numFmt w:val="bullet"/>
+      <w:lvlText w:val=""/>
+      <w:lvlJc w:val="left"/>
+      <w:pPr>
+        <w:tabs>
+          <w:tab w:val="num" w:pos="3600"/>
+        </w:tabs>
+        <w:ind w:left="3600" w:hanging="360"/>
+      </w:pPr>
+      <w:rPr>
+        <w:rFonts w:ascii="Wingdings" w:hAnsi="Wingdings" w:hint="default"/>
+        <w:sz w:val="20"/>
+      </w:rPr>
+    </w:lvl>
+    <w:lvl w:ilvl="5" w:tentative="1">
+      <w:start w:val="1"/>
+      <w:numFmt w:val="bullet"/>
+      <w:lvlText w:val=""/>
+      <w:lvlJc w:val="left"/>
+      <w:pPr>
+        <w:tabs>
+          <w:tab w:val="num" w:pos="4320"/>
+        </w:tabs>
+        <w:ind w:left="4320" w:hanging="360"/>
+      </w:pPr>
+      <w:rPr>
+        <w:rFonts w:ascii="Wingdings" w:hAnsi="Wingdings" w:hint="default"/>
+        <w:sz w:val="20"/>
+      </w:rPr>
+    </w:lvl>
+    <w:lvl w:ilvl="6" w:tentative="1">
+      <w:start w:val="1"/>
+      <w:numFmt w:val="bullet"/>
+      <w:lvlText w:val=""/>
+      <w:lvlJc w:val="left"/>
+      <w:pPr>
+        <w:tabs>
+          <w:tab w:val="num" w:pos="5040"/>
+        </w:tabs>
+        <w:ind w:left="5040" w:hanging="360"/>
+      </w:pPr>
+      <w:rPr>
+        <w:rFonts w:ascii="Wingdings" w:hAnsi="Wingdings" w:hint="default"/>
+        <w:sz w:val="20"/>
+      </w:rPr>
+    </w:lvl>
+    <w:lvl w:ilvl="7" w:tentative="1">
+      <w:start w:val="1"/>
+      <w:numFmt w:val="bullet"/>
+      <w:lvlText w:val=""/>
+      <w:lvlJc w:val="left"/>
+      <w:pPr>
+        <w:tabs>
+          <w:tab w:val="num" w:pos="5760"/>
+        </w:tabs>
+        <w:ind w:left="5760" w:hanging="360"/>
+      </w:pPr>
+      <w:rPr>
+        <w:rFonts w:ascii="Wingdings" w:hAnsi="Wingdings" w:hint="default"/>
+        <w:sz w:val="20"/>
+      </w:rPr>
+    </w:lvl>
+    <w:lvl w:ilvl="8" w:tentative="1">
+      <w:start w:val="1"/>
+      <w:numFmt w:val="bullet"/>
+      <w:lvlText w:val=""/>
+      <w:lvlJc w:val="left"/>
+      <w:pPr>
+        <w:tabs>
+          <w:tab w:val="num" w:pos="6480"/>
+        </w:tabs>
+        <w:ind w:left="6480" w:hanging="360"/>
+      </w:pPr>
+      <w:rPr>
+        <w:rFonts w:ascii="Wingdings" w:hAnsi="Wingdings" w:hint="default"/>
+        <w:sz w:val="20"/>
+      </w:rPr>
+    </w:lvl>
+  </w:abstractNum>
+  <w:abstractNum w:abstractNumId="6" w15:restartNumberingAfterBreak="0">
+    <w:nsid w:val="432B10A8"/>
+    <w:multiLevelType w:val="hybridMultilevel"/>
+    <w:tmpl w:val="651C77FE"/>
+    <w:lvl w:ilvl="0" w:tplc="08090001">
+      <w:start w:val="1"/>
+      <w:numFmt w:val="bullet"/>
+      <w:lvlText w:val=""/>
+      <w:lvlJc w:val="left"/>
+      <w:pPr>
+        <w:ind w:left="720" w:hanging="360"/>
+      </w:pPr>
+      <w:rPr>
+        <w:rFonts w:ascii="Symbol" w:hAnsi="Symbol" w:hint="default"/>
+      </w:rPr>
+    </w:lvl>
+    <w:lvl w:ilvl="1" w:tplc="08090003" w:tentative="1">
+      <w:start w:val="1"/>
+      <w:numFmt w:val="bullet"/>
+      <w:lvlText w:val="o"/>
+      <w:lvlJc w:val="left"/>
+      <w:pPr>
+        <w:ind w:left="1440" w:hanging="360"/>
+      </w:pPr>
+      <w:rPr>
+        <w:rFonts w:ascii="Courier New" w:hAnsi="Courier New" w:cs="Courier New" w:hint="default"/>
+      </w:rPr>
+    </w:lvl>
+    <w:lvl w:ilvl="2" w:tplc="08090005" w:tentative="1">
+      <w:start w:val="1"/>
+      <w:numFmt w:val="bullet"/>
+      <w:lvlText w:val=""/>
+      <w:lvlJc w:val="left"/>
+      <w:pPr>
+        <w:ind w:left="2160" w:hanging="360"/>
+      </w:pPr>
+      <w:rPr>
+        <w:rFonts w:ascii="Wingdings" w:hAnsi="Wingdings" w:hint="default"/>
+      </w:rPr>
+    </w:lvl>
+    <w:lvl w:ilvl="3" w:tplc="08090001" w:tentative="1">
+      <w:start w:val="1"/>
+      <w:numFmt w:val="bullet"/>
+      <w:lvlText w:val=""/>
+      <w:lvlJc w:val="left"/>
+      <w:pPr>
+        <w:ind w:left="2880" w:hanging="360"/>
+      </w:pPr>
+      <w:rPr>
+        <w:rFonts w:ascii="Symbol" w:hAnsi="Symbol" w:hint="default"/>
+      </w:rPr>
+    </w:lvl>
+    <w:lvl w:ilvl="4" w:tplc="08090003" w:tentative="1">
+      <w:start w:val="1"/>
+      <w:numFmt w:val="bullet"/>
+      <w:lvlText w:val="o"/>
+      <w:lvlJc w:val="left"/>
+      <w:pPr>
+        <w:ind w:left="3600" w:hanging="360"/>
+      </w:pPr>
+      <w:rPr>
+        <w:rFonts w:ascii="Courier New" w:hAnsi="Courier New" w:cs="Courier New" w:hint="default"/>
+      </w:rPr>
+    </w:lvl>
+    <w:lvl w:ilvl="5" w:tplc="08090005" w:tentative="1">
+      <w:start w:val="1"/>
+      <w:numFmt w:val="bullet"/>
+      <w:lvlText w:val=""/>
+      <w:lvlJc w:val="left"/>
+      <w:pPr>
+        <w:ind w:left="4320" w:hanging="360"/>
+      </w:pPr>
+      <w:rPr>
+        <w:rFonts w:ascii="Wingdings" w:hAnsi="Wingdings" w:hint="default"/>
+      </w:rPr>
+    </w:lvl>
+    <w:lvl w:ilvl="6" w:tplc="08090001" w:tentative="1">
+      <w:start w:val="1"/>
+      <w:numFmt w:val="bullet"/>
+      <w:lvlText w:val=""/>
+      <w:lvlJc w:val="left"/>
+      <w:pPr>
+        <w:ind w:left="5040" w:hanging="360"/>
+      </w:pPr>
+      <w:rPr>
+        <w:rFonts w:ascii="Symbol" w:hAnsi="Symbol" w:hint="default"/>
+      </w:rPr>
+    </w:lvl>
+    <w:lvl w:ilvl="7" w:tplc="08090003" w:tentative="1">
+      <w:start w:val="1"/>
+      <w:numFmt w:val="bullet"/>
+      <w:lvlText w:val="o"/>
+      <w:lvlJc w:val="left"/>
+      <w:pPr>
+        <w:ind w:left="5760" w:hanging="360"/>
+      </w:pPr>
+      <w:rPr>
+        <w:rFonts w:ascii="Courier New" w:hAnsi="Courier New" w:cs="Courier New" w:hint="default"/>
+      </w:rPr>
+    </w:lvl>
+    <w:lvl w:ilvl="8" w:tplc="08090005" w:tentative="1">
+      <w:start w:val="1"/>
+      <w:numFmt w:val="bullet"/>
+      <w:lvlText w:val=""/>
+      <w:lvlJc w:val="left"/>
+      <w:pPr>
+        <w:ind w:left="6480" w:hanging="360"/>
+      </w:pPr>
+      <w:rPr>
+        <w:rFonts w:ascii="Wingdings" w:hAnsi="Wingdings" w:hint="default"/>
+      </w:rPr>
+    </w:lvl>
+  </w:abstractNum>
+  <w:abstractNum w:abstractNumId="7" w15:restartNumberingAfterBreak="0">
+    <w:nsid w:val="45330103"/>
+    <w:multiLevelType w:val="multilevel"/>
+    <w:tmpl w:val="F3C8BF44"/>
+    <w:lvl w:ilvl="0">
+      <w:start w:val="1"/>
+      <w:numFmt w:val="bullet"/>
+      <w:lvlText w:val=""/>
+      <w:lvlJc w:val="left"/>
+      <w:pPr>
+        <w:tabs>
+          <w:tab w:val="num" w:pos="720"/>
+        </w:tabs>
+        <w:ind w:left="720" w:hanging="360"/>
+      </w:pPr>
+      <w:rPr>
+        <w:rFonts w:ascii="Symbol" w:hAnsi="Symbol" w:hint="default"/>
+        <w:sz w:val="20"/>
+      </w:rPr>
+    </w:lvl>
+    <w:lvl w:ilvl="1" w:tentative="1">
+      <w:start w:val="1"/>
+      <w:numFmt w:val="bullet"/>
+      <w:lvlText w:val="o"/>
+      <w:lvlJc w:val="left"/>
+      <w:pPr>
+        <w:tabs>
+          <w:tab w:val="num" w:pos="1440"/>
+        </w:tabs>
+        <w:ind w:left="1440" w:hanging="360"/>
+      </w:pPr>
+      <w:rPr>
+        <w:rFonts w:ascii="Courier New" w:hAnsi="Courier New" w:hint="default"/>
+        <w:sz w:val="20"/>
+      </w:rPr>
+    </w:lvl>
+    <w:lvl w:ilvl="2" w:tentative="1">
+      <w:start w:val="1"/>
+      <w:numFmt w:val="bullet"/>
+      <w:lvlText w:val=""/>
+      <w:lvlJc w:val="left"/>
+      <w:pPr>
+        <w:tabs>
+          <w:tab w:val="num" w:pos="2160"/>
+        </w:tabs>
+        <w:ind w:left="2160" w:hanging="360"/>
+      </w:pPr>
+      <w:rPr>
+        <w:rFonts w:ascii="Wingdings" w:hAnsi="Wingdings" w:hint="default"/>
+        <w:sz w:val="20"/>
+      </w:rPr>
+    </w:lvl>
+    <w:lvl w:ilvl="3" w:tentative="1">
+      <w:start w:val="1"/>
+      <w:numFmt w:val="bullet"/>
+      <w:lvlText w:val=""/>
+      <w:lvlJc w:val="left"/>
+      <w:pPr>
+        <w:tabs>
+          <w:tab w:val="num" w:pos="2880"/>
+        </w:tabs>
+        <w:ind w:left="2880" w:hanging="360"/>
+      </w:pPr>
+      <w:rPr>
+        <w:rFonts w:ascii="Wingdings" w:hAnsi="Wingdings" w:hint="default"/>
+        <w:sz w:val="20"/>
+      </w:rPr>
+    </w:lvl>
+    <w:lvl w:ilvl="4" w:tentative="1">
+      <w:start w:val="1"/>
+      <w:numFmt w:val="bullet"/>
+      <w:lvlText w:val=""/>
+      <w:lvlJc w:val="left"/>
+      <w:pPr>
+        <w:tabs>
+          <w:tab w:val="num" w:pos="3600"/>
+        </w:tabs>
+        <w:ind w:left="3600" w:hanging="360"/>
+      </w:pPr>
+      <w:rPr>
+        <w:rFonts w:ascii="Wingdings" w:hAnsi="Wingdings" w:hint="default"/>
+        <w:sz w:val="20"/>
+      </w:rPr>
+    </w:lvl>
+    <w:lvl w:ilvl="5" w:tentative="1">
+      <w:start w:val="1"/>
+      <w:numFmt w:val="bullet"/>
+      <w:lvlText w:val=""/>
+      <w:lvlJc w:val="left"/>
+      <w:pPr>
+        <w:tabs>
+          <w:tab w:val="num" w:pos="4320"/>
+        </w:tabs>
+        <w:ind w:left="4320" w:hanging="360"/>
+      </w:pPr>
+      <w:rPr>
+        <w:rFonts w:ascii="Wingdings" w:hAnsi="Wingdings" w:hint="default"/>
+        <w:sz w:val="20"/>
+      </w:rPr>
+    </w:lvl>
+    <w:lvl w:ilvl="6" w:tentative="1">
+      <w:start w:val="1"/>
+      <w:numFmt w:val="bullet"/>
+      <w:lvlText w:val=""/>
+      <w:lvlJc w:val="left"/>
+      <w:pPr>
+        <w:tabs>
+          <w:tab w:val="num" w:pos="5040"/>
+        </w:tabs>
+        <w:ind w:left="5040" w:hanging="360"/>
+      </w:pPr>
+      <w:rPr>
+        <w:rFonts w:ascii="Wingdings" w:hAnsi="Wingdings" w:hint="default"/>
+        <w:sz w:val="20"/>
+      </w:rPr>
+    </w:lvl>
+    <w:lvl w:ilvl="7" w:tentative="1">
+      <w:start w:val="1"/>
+      <w:numFmt w:val="bullet"/>
+      <w:lvlText w:val=""/>
+      <w:lvlJc w:val="left"/>
+      <w:pPr>
+        <w:tabs>
+          <w:tab w:val="num" w:pos="5760"/>
+        </w:tabs>
+        <w:ind w:left="5760" w:hanging="360"/>
+      </w:pPr>
+      <w:rPr>
+        <w:rFonts w:ascii="Wingdings" w:hAnsi="Wingdings" w:hint="default"/>
+        <w:sz w:val="20"/>
+      </w:rPr>
+    </w:lvl>
+    <w:lvl w:ilvl="8" w:tentative="1">
+      <w:start w:val="1"/>
+      <w:numFmt w:val="bullet"/>
+      <w:lvlText w:val=""/>
+      <w:lvlJc w:val="left"/>
+      <w:pPr>
+        <w:tabs>
+          <w:tab w:val="num" w:pos="6480"/>
+        </w:tabs>
+        <w:ind w:left="6480" w:hanging="360"/>
+      </w:pPr>
+      <w:rPr>
+        <w:rFonts w:ascii="Wingdings" w:hAnsi="Wingdings" w:hint="default"/>
+        <w:sz w:val="20"/>
+      </w:rPr>
+    </w:lvl>
+  </w:abstractNum>
+  <w:abstractNum w:abstractNumId="8" w15:restartNumberingAfterBreak="0">
     <w:nsid w:val="46946042"/>
     <w:multiLevelType w:val="hybridMultilevel"/>
     <w:tmpl w:val="23CA8804"/>
@@ -2432,7 +4446,7 @@
       </w:rPr>
     </w:lvl>
   </w:abstractNum>
-  <w:abstractNum w:abstractNumId="3" w15:restartNumberingAfterBreak="0">
+  <w:abstractNum w:abstractNumId="9" w15:restartNumberingAfterBreak="0">
     <w:nsid w:val="492603D0"/>
     <w:multiLevelType w:val="multilevel"/>
     <w:tmpl w:val="F45E4296"/>
@@ -2581,17 +4595,187 @@
       </w:rPr>
     </w:lvl>
   </w:abstractNum>
+  <w:abstractNum w:abstractNumId="10" w15:restartNumberingAfterBreak="0">
+    <w:nsid w:val="4E9D2739"/>
+    <w:multiLevelType w:val="multilevel"/>
+    <w:tmpl w:val="F23807C6"/>
+    <w:lvl w:ilvl="0">
+      <w:start w:val="1"/>
+      <w:numFmt w:val="bullet"/>
+      <w:lvlText w:val=""/>
+      <w:lvlJc w:val="left"/>
+      <w:pPr>
+        <w:tabs>
+          <w:tab w:val="num" w:pos="720"/>
+        </w:tabs>
+        <w:ind w:left="720" w:hanging="360"/>
+      </w:pPr>
+      <w:rPr>
+        <w:rFonts w:ascii="Symbol" w:hAnsi="Symbol" w:hint="default"/>
+        <w:sz w:val="20"/>
+      </w:rPr>
+    </w:lvl>
+    <w:lvl w:ilvl="1" w:tentative="1">
+      <w:start w:val="1"/>
+      <w:numFmt w:val="bullet"/>
+      <w:lvlText w:val="o"/>
+      <w:lvlJc w:val="left"/>
+      <w:pPr>
+        <w:tabs>
+          <w:tab w:val="num" w:pos="1440"/>
+        </w:tabs>
+        <w:ind w:left="1440" w:hanging="360"/>
+      </w:pPr>
+      <w:rPr>
+        <w:rFonts w:ascii="Courier New" w:hAnsi="Courier New" w:hint="default"/>
+        <w:sz w:val="20"/>
+      </w:rPr>
+    </w:lvl>
+    <w:lvl w:ilvl="2" w:tentative="1">
+      <w:start w:val="1"/>
+      <w:numFmt w:val="bullet"/>
+      <w:lvlText w:val=""/>
+      <w:lvlJc w:val="left"/>
+      <w:pPr>
+        <w:tabs>
+          <w:tab w:val="num" w:pos="2160"/>
+        </w:tabs>
+        <w:ind w:left="2160" w:hanging="360"/>
+      </w:pPr>
+      <w:rPr>
+        <w:rFonts w:ascii="Wingdings" w:hAnsi="Wingdings" w:hint="default"/>
+        <w:sz w:val="20"/>
+      </w:rPr>
+    </w:lvl>
+    <w:lvl w:ilvl="3" w:tentative="1">
+      <w:start w:val="1"/>
+      <w:numFmt w:val="bullet"/>
+      <w:lvlText w:val=""/>
+      <w:lvlJc w:val="left"/>
+      <w:pPr>
+        <w:tabs>
+          <w:tab w:val="num" w:pos="2880"/>
+        </w:tabs>
+        <w:ind w:left="2880" w:hanging="360"/>
+      </w:pPr>
+      <w:rPr>
+        <w:rFonts w:ascii="Wingdings" w:hAnsi="Wingdings" w:hint="default"/>
+        <w:sz w:val="20"/>
+      </w:rPr>
+    </w:lvl>
+    <w:lvl w:ilvl="4" w:tentative="1">
+      <w:start w:val="1"/>
+      <w:numFmt w:val="bullet"/>
+      <w:lvlText w:val=""/>
+      <w:lvlJc w:val="left"/>
+      <w:pPr>
+        <w:tabs>
+          <w:tab w:val="num" w:pos="3600"/>
+        </w:tabs>
+        <w:ind w:left="3600" w:hanging="360"/>
+      </w:pPr>
+      <w:rPr>
+        <w:rFonts w:ascii="Wingdings" w:hAnsi="Wingdings" w:hint="default"/>
+        <w:sz w:val="20"/>
+      </w:rPr>
+    </w:lvl>
+    <w:lvl w:ilvl="5" w:tentative="1">
+      <w:start w:val="1"/>
+      <w:numFmt w:val="bullet"/>
+      <w:lvlText w:val=""/>
+      <w:lvlJc w:val="left"/>
+      <w:pPr>
+        <w:tabs>
+          <w:tab w:val="num" w:pos="4320"/>
+        </w:tabs>
+        <w:ind w:left="4320" w:hanging="360"/>
+      </w:pPr>
+      <w:rPr>
+        <w:rFonts w:ascii="Wingdings" w:hAnsi="Wingdings" w:hint="default"/>
+        <w:sz w:val="20"/>
+      </w:rPr>
+    </w:lvl>
+    <w:lvl w:ilvl="6" w:tentative="1">
+      <w:start w:val="1"/>
+      <w:numFmt w:val="bullet"/>
+      <w:lvlText w:val=""/>
+      <w:lvlJc w:val="left"/>
+      <w:pPr>
+        <w:tabs>
+          <w:tab w:val="num" w:pos="5040"/>
+        </w:tabs>
+        <w:ind w:left="5040" w:hanging="360"/>
+      </w:pPr>
+      <w:rPr>
+        <w:rFonts w:ascii="Wingdings" w:hAnsi="Wingdings" w:hint="default"/>
+        <w:sz w:val="20"/>
+      </w:rPr>
+    </w:lvl>
+    <w:lvl w:ilvl="7" w:tentative="1">
+      <w:start w:val="1"/>
+      <w:numFmt w:val="bullet"/>
+      <w:lvlText w:val=""/>
+      <w:lvlJc w:val="left"/>
+      <w:pPr>
+        <w:tabs>
+          <w:tab w:val="num" w:pos="5760"/>
+        </w:tabs>
+        <w:ind w:left="5760" w:hanging="360"/>
+      </w:pPr>
+      <w:rPr>
+        <w:rFonts w:ascii="Wingdings" w:hAnsi="Wingdings" w:hint="default"/>
+        <w:sz w:val="20"/>
+      </w:rPr>
+    </w:lvl>
+    <w:lvl w:ilvl="8" w:tentative="1">
+      <w:start w:val="1"/>
+      <w:numFmt w:val="bullet"/>
+      <w:lvlText w:val=""/>
+      <w:lvlJc w:val="left"/>
+      <w:pPr>
+        <w:tabs>
+          <w:tab w:val="num" w:pos="6480"/>
+        </w:tabs>
+        <w:ind w:left="6480" w:hanging="360"/>
+      </w:pPr>
+      <w:rPr>
+        <w:rFonts w:ascii="Wingdings" w:hAnsi="Wingdings" w:hint="default"/>
+        <w:sz w:val="20"/>
+      </w:rPr>
+    </w:lvl>
+  </w:abstractNum>
   <w:num w:numId="1" w16cid:durableId="1118452716">
+    <w:abstractNumId w:val="4"/>
+  </w:num>
+  <w:num w:numId="2" w16cid:durableId="1136098253">
     <w:abstractNumId w:val="1"/>
   </w:num>
-  <w:num w:numId="2" w16cid:durableId="1136098253">
+  <w:num w:numId="3" w16cid:durableId="2046104017">
+    <w:abstractNumId w:val="9"/>
+  </w:num>
+  <w:num w:numId="4" w16cid:durableId="1098715201">
+    <w:abstractNumId w:val="8"/>
+  </w:num>
+  <w:num w:numId="5" w16cid:durableId="1372651733">
     <w:abstractNumId w:val="0"/>
   </w:num>
-  <w:num w:numId="3" w16cid:durableId="2046104017">
+  <w:num w:numId="6" w16cid:durableId="1864198626">
+    <w:abstractNumId w:val="2"/>
+  </w:num>
+  <w:num w:numId="7" w16cid:durableId="414713096">
+    <w:abstractNumId w:val="7"/>
+  </w:num>
+  <w:num w:numId="8" w16cid:durableId="1190025026">
     <w:abstractNumId w:val="3"/>
   </w:num>
-  <w:num w:numId="4" w16cid:durableId="1098715201">
-    <w:abstractNumId w:val="2"/>
+  <w:num w:numId="9" w16cid:durableId="1993094545">
+    <w:abstractNumId w:val="6"/>
+  </w:num>
+  <w:num w:numId="10" w16cid:durableId="1076711656">
+    <w:abstractNumId w:val="10"/>
+  </w:num>
+  <w:num w:numId="11" w16cid:durableId="935362017">
+    <w:abstractNumId w:val="5"/>
   </w:num>
 </w:numbering>
 </file>
@@ -3570,6 +5754,36 @@
     <w:basedOn w:val="DefaultParagraphFont"/>
     <w:rsid w:val="00A9697D"/>
   </w:style>
+  <w:style w:type="character" w:customStyle="1" w:styleId="citation-136">
+    <w:name w:val="citation-136"/>
+    <w:basedOn w:val="DefaultParagraphFont"/>
+    <w:rsid w:val="0037314F"/>
+  </w:style>
+  <w:style w:type="character" w:customStyle="1" w:styleId="citation-135">
+    <w:name w:val="citation-135"/>
+    <w:basedOn w:val="DefaultParagraphFont"/>
+    <w:rsid w:val="0037314F"/>
+  </w:style>
+  <w:style w:type="character" w:customStyle="1" w:styleId="citation-134">
+    <w:name w:val="citation-134"/>
+    <w:basedOn w:val="DefaultParagraphFont"/>
+    <w:rsid w:val="0037314F"/>
+  </w:style>
+  <w:style w:type="character" w:customStyle="1" w:styleId="citation-133">
+    <w:name w:val="citation-133"/>
+    <w:basedOn w:val="DefaultParagraphFont"/>
+    <w:rsid w:val="0037314F"/>
+  </w:style>
+  <w:style w:type="character" w:customStyle="1" w:styleId="citation-132">
+    <w:name w:val="citation-132"/>
+    <w:basedOn w:val="DefaultParagraphFont"/>
+    <w:rsid w:val="0037314F"/>
+  </w:style>
+  <w:style w:type="character" w:customStyle="1" w:styleId="citation-24">
+    <w:name w:val="citation-24"/>
+    <w:basedOn w:val="DefaultParagraphFont"/>
+    <w:rsid w:val="00536077"/>
+  </w:style>
 </w:styles>
 </file>
 

</xml_diff>